<commit_message>
Update documentation to reflect actual implementation
</commit_message>
<xml_diff>
--- a/docs/report.docx
+++ b/docs/report.docx
@@ -4478,8 +4478,6 @@
         </w:rPr>
         <w:t xml:space="preserve">  分层架构图</w:t>
       </w:r>
-      <w:bookmarkStart w:id="36" w:name="_GoBack"/>
-      <w:bookmarkEnd w:id="36"/>
     </w:p>
     <w:p>
       <w:pPr>
@@ -4552,7 +4550,7 @@
           <w:rFonts w:hint="eastAsia"/>
           <w:lang w:eastAsia="zh-CN"/>
         </w:rPr>
-        <w:t>（1）UI层：使用Jetpack Compose + Material 3，实现6个主要界面：启动界面、相机界面、编辑界面、裁剪界面、调色界面和设置界面。</w:t>
+        <w:t>（1）UI层：使用Jetpack Compose + Material 3，实现6个主要界面：SplashScreen（启动界面）、CameraScreen（相机界面）、EditScreen（编辑界面）、CropScreen（裁剪界面）、ColorAdjustScreen（调色界面）和SettingsScreen（设置界面）。采用声明式UI设计，遵循Material Design 3规范，深色主题优先，符合摄影场景的视觉需求。</w:t>
       </w:r>
     </w:p>
     <w:p>
@@ -4570,7 +4568,7 @@
           <w:rFonts w:hint="eastAsia"/>
           <w:lang w:eastAsia="zh-CN"/>
         </w:rPr>
-        <w:t>（2）业务逻辑层：使用Kotlin + ViewModel + Coroutines，实现CameraManager、AIAnalyzer、ImageProcessor、DataManager等核心模块。</w:t>
+        <w:t>（2）业务逻辑层：使用Kotlin + ViewModel + Coroutines，实现CameraBackend（相机控制）、AiBackend（AI推理）、ColorBackend（调色处理）、CropBackend（智能裁剪）、StorageBackend（数据存储）、HdrService（HDR拍照）、CloudAiService（云端AI调用）等核心模块。采用单一职责原则，每个Backend负责一个功能域，使用ViewModel管理UI状态，Coroutines处理异步操作。</w:t>
       </w:r>
     </w:p>
     <w:p>
@@ -4588,7 +4586,7 @@
           <w:rFonts w:hint="eastAsia"/>
           <w:lang w:eastAsia="zh-CN"/>
         </w:rPr>
-        <w:t>（3）AI与图像处理层：集成ML Kit（场景识别、人脸检测、对象检测）、ONNX Runtime（模型推理）、OpenCV（几何分析）、GPUImage（滤镜处理）。</w:t>
+        <w:t>（3）AI与图像处理层：集成ML Kit（Image Labeling场景识别、Face Detection人脸检测、Object Detection对象检测）、ONNX Runtime（MobileNetV2色彩增强模型推理，5维参数输出）、OpenCV 4.9（边缘检测、水平线检测、对称性分析、引导线检测、前景区域检测、色彩分布分析）、OpenGL ES（GLES20/GLES30，HDR后处理管线）。采用双轨AI架构，本地轻量化模型负责实时性要求高的功能，云端大模型（阿里云百炼qwen-vl-plus）提供深度场景理解和专业摄影建议。</w:t>
       </w:r>
     </w:p>
     <w:p>
@@ -4781,6 +4779,40 @@
       <w:bookmarkEnd w:id="14"/>
       <w:bookmarkEnd w:id="15"/>
     </w:p>
+    <w:p>
+      <w:pPr>
+        <w:pStyle w:val="12"/>
+        <w:rPr>
+          <w:rFonts w:hint="default" w:eastAsia="宋体"/>
+          <w:lang w:val="en-US" w:eastAsia="zh-CN"/>
+        </w:rPr>
+      </w:pPr>
+      <w:r>
+        <w:t xml:space="preserve">表 </w:t>
+      </w:r>
+      <w:r>
+        <w:fldChar w:fldCharType="begin"/>
+      </w:r>
+      <w:r>
+        <w:instrText xml:space="preserve"> SEQ 表 \* ARABIC </w:instrText>
+      </w:r>
+      <w:r>
+        <w:fldChar w:fldCharType="separate"/>
+      </w:r>
+      <w:r>
+        <w:t>2</w:t>
+      </w:r>
+      <w:r>
+        <w:fldChar w:fldCharType="end"/>
+      </w:r>
+      <w:r>
+        <w:rPr>
+          <w:rFonts w:hint="eastAsia"/>
+          <w:lang w:val="en-US" w:eastAsia="zh-CN"/>
+        </w:rPr>
+        <w:t xml:space="preserve">  技术栈</w:t>
+      </w:r>
+    </w:p>
     <w:tbl>
       <w:tblPr>
         <w:tblStyle w:val="21"/>
@@ -4803,9 +4835,9 @@
         </w:tblCellMar>
       </w:tblPr>
       <w:tblGrid>
-        <w:gridCol w:w="2086"/>
-        <w:gridCol w:w="4920"/>
-        <w:gridCol w:w="1320"/>
+        <w:gridCol w:w="2058"/>
+        <w:gridCol w:w="4860"/>
+        <w:gridCol w:w="1408"/>
       </w:tblGrid>
       <w:tr>
         <w:tblPrEx>
@@ -5169,6 +5201,126 @@
         </w:tblPrEx>
         <w:tc>
           <w:tcPr>
+            <w:tcW w:w="2058" w:type="dxa"/>
+            <w:tcBorders>
+              <w:top w:val="nil"/>
+              <w:left w:val="nil"/>
+              <w:bottom w:val="nil"/>
+              <w:right w:val="nil"/>
+            </w:tcBorders>
+            <w:shd w:val="clear" w:color="auto" w:fill="FFFFFF"/>
+            <w:vAlign w:val="center"/>
+          </w:tcPr>
+          <w:p>
+            <w:pPr>
+              <w:pStyle w:val="41"/>
+              <w:spacing w:before="93" w:after="93"/>
+              <w:rPr>
+                <w:rFonts w:hint="eastAsia"/>
+                <w:b w:val="0"/>
+                <w:color w:val="000000"/>
+                <w:lang w:eastAsia="zh-CN"/>
+              </w:rPr>
+            </w:pPr>
+            <w:r>
+              <w:rPr>
+                <w:rFonts w:hint="eastAsia"/>
+                <w:b w:val="0"/>
+                <w:color w:val="000000"/>
+                <w:lang w:eastAsia="zh-CN"/>
+              </w:rPr>
+              <w:t>设计系统</w:t>
+            </w:r>
+          </w:p>
+        </w:tc>
+        <w:tc>
+          <w:tcPr>
+            <w:tcW w:w="4860" w:type="dxa"/>
+            <w:tcBorders>
+              <w:top w:val="nil"/>
+              <w:left w:val="nil"/>
+              <w:bottom w:val="nil"/>
+              <w:right w:val="nil"/>
+            </w:tcBorders>
+            <w:shd w:val="clear" w:color="auto" w:fill="FFFFFF"/>
+            <w:vAlign w:val="center"/>
+          </w:tcPr>
+          <w:p>
+            <w:pPr>
+              <w:pStyle w:val="41"/>
+              <w:spacing w:before="93" w:after="93"/>
+              <w:rPr>
+                <w:rFonts w:hint="eastAsia"/>
+                <w:b w:val="0"/>
+                <w:color w:val="000000"/>
+                <w:lang w:eastAsia="zh-CN"/>
+              </w:rPr>
+            </w:pPr>
+            <w:r>
+              <w:rPr>
+                <w:rFonts w:hint="eastAsia"/>
+                <w:b w:val="0"/>
+                <w:color w:val="000000"/>
+                <w:lang w:eastAsia="zh-CN"/>
+              </w:rPr>
+              <w:t>Material 3</w:t>
+            </w:r>
+          </w:p>
+        </w:tc>
+        <w:tc>
+          <w:tcPr>
+            <w:tcW w:w="1408" w:type="dxa"/>
+            <w:tcBorders>
+              <w:top w:val="nil"/>
+              <w:left w:val="nil"/>
+              <w:bottom w:val="nil"/>
+              <w:right w:val="nil"/>
+            </w:tcBorders>
+            <w:shd w:val="clear" w:color="auto" w:fill="FFFFFF"/>
+            <w:vAlign w:val="center"/>
+          </w:tcPr>
+          <w:p>
+            <w:pPr>
+              <w:pStyle w:val="41"/>
+              <w:spacing w:before="93" w:after="93"/>
+              <w:rPr>
+                <w:rFonts w:hint="eastAsia"/>
+                <w:b w:val="0"/>
+                <w:color w:val="000000"/>
+                <w:lang w:eastAsia="zh-CN"/>
+              </w:rPr>
+            </w:pPr>
+            <w:r>
+              <w:rPr>
+                <w:rFonts w:hint="eastAsia"/>
+                <w:b w:val="0"/>
+                <w:color w:val="000000"/>
+                <w:lang w:eastAsia="zh-CN"/>
+              </w:rPr>
+              <w:t>-</w:t>
+            </w:r>
+          </w:p>
+        </w:tc>
+      </w:tr>
+      <w:tr>
+        <w:tblPrEx>
+          <w:tblBorders>
+            <w:top w:val="single" w:color="auto" w:sz="4" w:space="0"/>
+            <w:left w:val="single" w:color="auto" w:sz="4" w:space="0"/>
+            <w:bottom w:val="single" w:color="auto" w:sz="4" w:space="0"/>
+            <w:right w:val="single" w:color="auto" w:sz="4" w:space="0"/>
+            <w:insideH w:val="single" w:color="auto" w:sz="4" w:space="0"/>
+            <w:insideV w:val="single" w:color="auto" w:sz="4" w:space="0"/>
+          </w:tblBorders>
+          <w:tblCellMar>
+            <w:top w:w="0" w:type="dxa"/>
+            <w:left w:w="10" w:type="dxa"/>
+            <w:bottom w:w="0" w:type="dxa"/>
+            <w:right w:w="10" w:type="dxa"/>
+          </w:tblCellMar>
+        </w:tblPrEx>
+        <w:tc>
+          <w:tcPr>
             <w:tcBorders>
               <w:top w:val="nil"/>
               <w:left w:val="nil"/>
@@ -5228,15 +5380,6 @@
                 <w:lang w:eastAsia="zh-CN"/>
               </w:rPr>
               <w:t>CameraX</w:t>
-            </w:r>
-            <w:r>
-              <w:rPr>
-                <w:rFonts w:hint="eastAsia"/>
-                <w:b w:val="0"/>
-                <w:color w:val="000000"/>
-                <w:lang w:val="en-US" w:eastAsia="zh-CN"/>
-              </w:rPr>
-              <w:t>+Camera2</w:t>
             </w:r>
           </w:p>
         </w:tc>
@@ -5406,6 +5549,607 @@
         </w:tblPrEx>
         <w:tc>
           <w:tcPr>
+            <w:tcW w:w="2058" w:type="dxa"/>
+            <w:tcBorders>
+              <w:top w:val="nil"/>
+              <w:left w:val="nil"/>
+              <w:bottom w:val="nil"/>
+              <w:right w:val="nil"/>
+            </w:tcBorders>
+            <w:shd w:val="clear" w:color="auto" w:fill="FFFFFF"/>
+            <w:vAlign w:val="center"/>
+          </w:tcPr>
+          <w:p>
+            <w:pPr>
+              <w:pStyle w:val="41"/>
+              <w:spacing w:before="93" w:after="93"/>
+              <w:rPr>
+                <w:rFonts w:hint="eastAsia"/>
+                <w:b w:val="0"/>
+                <w:color w:val="000000"/>
+                <w:lang w:eastAsia="zh-CN"/>
+              </w:rPr>
+            </w:pPr>
+            <w:r>
+              <w:rPr>
+                <w:rFonts w:hint="eastAsia"/>
+                <w:b w:val="0"/>
+                <w:color w:val="000000"/>
+                <w:lang w:eastAsia="zh-CN"/>
+              </w:rPr>
+              <w:t>场景识别</w:t>
+            </w:r>
+          </w:p>
+        </w:tc>
+        <w:tc>
+          <w:tcPr>
+            <w:tcW w:w="4860" w:type="dxa"/>
+            <w:tcBorders>
+              <w:top w:val="nil"/>
+              <w:left w:val="nil"/>
+              <w:bottom w:val="nil"/>
+              <w:right w:val="nil"/>
+            </w:tcBorders>
+            <w:shd w:val="clear" w:color="auto" w:fill="FFFFFF"/>
+            <w:vAlign w:val="center"/>
+          </w:tcPr>
+          <w:p>
+            <w:pPr>
+              <w:pStyle w:val="41"/>
+              <w:spacing w:before="93" w:after="93"/>
+              <w:rPr>
+                <w:rFonts w:hint="eastAsia"/>
+                <w:b w:val="0"/>
+                <w:color w:val="000000"/>
+                <w:lang w:eastAsia="zh-CN"/>
+              </w:rPr>
+            </w:pPr>
+            <w:r>
+              <w:rPr>
+                <w:rFonts w:hint="eastAsia"/>
+                <w:b w:val="0"/>
+                <w:color w:val="000000"/>
+                <w:lang w:eastAsia="zh-CN"/>
+              </w:rPr>
+              <w:t>ML Kit Image Labeling</w:t>
+            </w:r>
+          </w:p>
+        </w:tc>
+        <w:tc>
+          <w:tcPr>
+            <w:tcW w:w="1408" w:type="dxa"/>
+            <w:tcBorders>
+              <w:top w:val="nil"/>
+              <w:left w:val="nil"/>
+              <w:bottom w:val="nil"/>
+              <w:right w:val="nil"/>
+            </w:tcBorders>
+            <w:shd w:val="clear" w:color="auto" w:fill="FFFFFF"/>
+            <w:vAlign w:val="center"/>
+          </w:tcPr>
+          <w:p>
+            <w:pPr>
+              <w:pStyle w:val="41"/>
+              <w:spacing w:before="93" w:after="93"/>
+              <w:rPr>
+                <w:rFonts w:hint="eastAsia"/>
+                <w:b w:val="0"/>
+                <w:color w:val="000000"/>
+                <w:lang w:eastAsia="zh-CN"/>
+              </w:rPr>
+            </w:pPr>
+            <w:r>
+              <w:rPr>
+                <w:rFonts w:hint="eastAsia"/>
+                <w:b w:val="0"/>
+                <w:color w:val="000000"/>
+                <w:lang w:eastAsia="zh-CN"/>
+              </w:rPr>
+              <w:t>17.0.9</w:t>
+            </w:r>
+          </w:p>
+        </w:tc>
+      </w:tr>
+      <w:tr>
+        <w:tblPrEx>
+          <w:tblBorders>
+            <w:top w:val="single" w:color="auto" w:sz="4" w:space="0"/>
+            <w:left w:val="single" w:color="auto" w:sz="4" w:space="0"/>
+            <w:bottom w:val="single" w:color="auto" w:sz="4" w:space="0"/>
+            <w:right w:val="single" w:color="auto" w:sz="4" w:space="0"/>
+            <w:insideH w:val="single" w:color="auto" w:sz="4" w:space="0"/>
+            <w:insideV w:val="single" w:color="auto" w:sz="4" w:space="0"/>
+          </w:tblBorders>
+          <w:tblCellMar>
+            <w:top w:w="0" w:type="dxa"/>
+            <w:left w:w="10" w:type="dxa"/>
+            <w:bottom w:w="0" w:type="dxa"/>
+            <w:right w:w="10" w:type="dxa"/>
+          </w:tblCellMar>
+        </w:tblPrEx>
+        <w:tc>
+          <w:tcPr>
+            <w:tcW w:w="2058" w:type="dxa"/>
+            <w:tcBorders>
+              <w:top w:val="nil"/>
+              <w:left w:val="nil"/>
+              <w:bottom w:val="nil"/>
+              <w:right w:val="nil"/>
+            </w:tcBorders>
+            <w:shd w:val="clear" w:color="auto" w:fill="FFFFFF"/>
+            <w:vAlign w:val="center"/>
+          </w:tcPr>
+          <w:p>
+            <w:pPr>
+              <w:pStyle w:val="41"/>
+              <w:spacing w:before="93" w:after="93"/>
+              <w:rPr>
+                <w:rFonts w:hint="eastAsia"/>
+                <w:b w:val="0"/>
+                <w:color w:val="000000"/>
+                <w:lang w:eastAsia="zh-CN"/>
+              </w:rPr>
+            </w:pPr>
+            <w:r>
+              <w:rPr>
+                <w:rFonts w:hint="eastAsia"/>
+                <w:b w:val="0"/>
+                <w:color w:val="000000"/>
+                <w:lang w:eastAsia="zh-CN"/>
+              </w:rPr>
+              <w:t>人脸检测</w:t>
+            </w:r>
+          </w:p>
+        </w:tc>
+        <w:tc>
+          <w:tcPr>
+            <w:tcW w:w="4860" w:type="dxa"/>
+            <w:tcBorders>
+              <w:top w:val="nil"/>
+              <w:left w:val="nil"/>
+              <w:bottom w:val="nil"/>
+              <w:right w:val="nil"/>
+            </w:tcBorders>
+            <w:shd w:val="clear" w:color="auto" w:fill="FFFFFF"/>
+            <w:vAlign w:val="center"/>
+          </w:tcPr>
+          <w:p>
+            <w:pPr>
+              <w:pStyle w:val="41"/>
+              <w:spacing w:before="93" w:after="93"/>
+              <w:rPr>
+                <w:rFonts w:hint="eastAsia"/>
+                <w:b w:val="0"/>
+                <w:color w:val="000000"/>
+                <w:lang w:eastAsia="zh-CN"/>
+              </w:rPr>
+            </w:pPr>
+            <w:r>
+              <w:rPr>
+                <w:rFonts w:hint="eastAsia"/>
+                <w:b w:val="0"/>
+                <w:color w:val="000000"/>
+                <w:lang w:eastAsia="zh-CN"/>
+              </w:rPr>
+              <w:t>ML Kit Face Detection</w:t>
+            </w:r>
+          </w:p>
+        </w:tc>
+        <w:tc>
+          <w:tcPr>
+            <w:tcW w:w="1408" w:type="dxa"/>
+            <w:tcBorders>
+              <w:top w:val="nil"/>
+              <w:left w:val="nil"/>
+              <w:bottom w:val="nil"/>
+              <w:right w:val="nil"/>
+            </w:tcBorders>
+            <w:shd w:val="clear" w:color="auto" w:fill="FFFFFF"/>
+            <w:vAlign w:val="center"/>
+          </w:tcPr>
+          <w:p>
+            <w:pPr>
+              <w:pStyle w:val="41"/>
+              <w:spacing w:before="93" w:after="93"/>
+              <w:rPr>
+                <w:rFonts w:hint="eastAsia"/>
+                <w:b w:val="0"/>
+                <w:color w:val="000000"/>
+                <w:lang w:eastAsia="zh-CN"/>
+              </w:rPr>
+            </w:pPr>
+            <w:r>
+              <w:rPr>
+                <w:rFonts w:hint="eastAsia"/>
+                <w:b w:val="0"/>
+                <w:color w:val="000000"/>
+                <w:lang w:eastAsia="zh-CN"/>
+              </w:rPr>
+              <w:t>16.1.7</w:t>
+            </w:r>
+          </w:p>
+        </w:tc>
+      </w:tr>
+      <w:tr>
+        <w:tblPrEx>
+          <w:tblBorders>
+            <w:top w:val="single" w:color="auto" w:sz="4" w:space="0"/>
+            <w:left w:val="single" w:color="auto" w:sz="4" w:space="0"/>
+            <w:bottom w:val="single" w:color="auto" w:sz="4" w:space="0"/>
+            <w:right w:val="single" w:color="auto" w:sz="4" w:space="0"/>
+            <w:insideH w:val="single" w:color="auto" w:sz="4" w:space="0"/>
+            <w:insideV w:val="single" w:color="auto" w:sz="4" w:space="0"/>
+          </w:tblBorders>
+          <w:tblCellMar>
+            <w:top w:w="0" w:type="dxa"/>
+            <w:left w:w="10" w:type="dxa"/>
+            <w:bottom w:w="0" w:type="dxa"/>
+            <w:right w:w="10" w:type="dxa"/>
+          </w:tblCellMar>
+        </w:tblPrEx>
+        <w:tc>
+          <w:tcPr>
+            <w:tcW w:w="2058" w:type="dxa"/>
+            <w:tcBorders>
+              <w:top w:val="nil"/>
+              <w:left w:val="nil"/>
+              <w:bottom w:val="nil"/>
+              <w:right w:val="nil"/>
+            </w:tcBorders>
+            <w:shd w:val="clear" w:color="auto" w:fill="FFFFFF"/>
+            <w:vAlign w:val="center"/>
+          </w:tcPr>
+          <w:p>
+            <w:pPr>
+              <w:pStyle w:val="41"/>
+              <w:spacing w:before="93" w:after="93"/>
+              <w:rPr>
+                <w:rFonts w:hint="eastAsia"/>
+                <w:b w:val="0"/>
+                <w:color w:val="000000"/>
+                <w:lang w:eastAsia="zh-CN"/>
+              </w:rPr>
+            </w:pPr>
+            <w:r>
+              <w:rPr>
+                <w:rFonts w:hint="eastAsia"/>
+                <w:b w:val="0"/>
+                <w:color w:val="000000"/>
+                <w:lang w:eastAsia="zh-CN"/>
+              </w:rPr>
+              <w:t>物体检测</w:t>
+            </w:r>
+          </w:p>
+        </w:tc>
+        <w:tc>
+          <w:tcPr>
+            <w:tcW w:w="4860" w:type="dxa"/>
+            <w:tcBorders>
+              <w:top w:val="nil"/>
+              <w:left w:val="nil"/>
+              <w:bottom w:val="nil"/>
+              <w:right w:val="nil"/>
+            </w:tcBorders>
+            <w:shd w:val="clear" w:color="auto" w:fill="FFFFFF"/>
+            <w:vAlign w:val="center"/>
+          </w:tcPr>
+          <w:p>
+            <w:pPr>
+              <w:pStyle w:val="41"/>
+              <w:spacing w:before="93" w:after="93"/>
+              <w:rPr>
+                <w:rFonts w:hint="eastAsia"/>
+                <w:b w:val="0"/>
+                <w:color w:val="000000"/>
+                <w:lang w:eastAsia="zh-CN"/>
+              </w:rPr>
+            </w:pPr>
+            <w:r>
+              <w:rPr>
+                <w:rFonts w:hint="eastAsia"/>
+                <w:b w:val="0"/>
+                <w:color w:val="000000"/>
+                <w:lang w:eastAsia="zh-CN"/>
+              </w:rPr>
+              <w:t>ML Kit Object Detection</w:t>
+            </w:r>
+          </w:p>
+        </w:tc>
+        <w:tc>
+          <w:tcPr>
+            <w:tcW w:w="1408" w:type="dxa"/>
+            <w:tcBorders>
+              <w:top w:val="nil"/>
+              <w:left w:val="nil"/>
+              <w:bottom w:val="nil"/>
+              <w:right w:val="nil"/>
+            </w:tcBorders>
+            <w:shd w:val="clear" w:color="auto" w:fill="FFFFFF"/>
+            <w:vAlign w:val="center"/>
+          </w:tcPr>
+          <w:p>
+            <w:pPr>
+              <w:pStyle w:val="41"/>
+              <w:spacing w:before="93" w:after="93"/>
+              <w:rPr>
+                <w:rFonts w:hint="eastAsia"/>
+                <w:b w:val="0"/>
+                <w:color w:val="000000"/>
+                <w:lang w:eastAsia="zh-CN"/>
+              </w:rPr>
+            </w:pPr>
+            <w:r>
+              <w:rPr>
+                <w:rFonts w:hint="eastAsia"/>
+                <w:b w:val="0"/>
+                <w:color w:val="000000"/>
+                <w:lang w:eastAsia="zh-CN"/>
+              </w:rPr>
+              <w:t>17.0.2</w:t>
+            </w:r>
+          </w:p>
+        </w:tc>
+      </w:tr>
+      <w:tr>
+        <w:tblPrEx>
+          <w:tblBorders>
+            <w:top w:val="single" w:color="auto" w:sz="4" w:space="0"/>
+            <w:left w:val="single" w:color="auto" w:sz="4" w:space="0"/>
+            <w:bottom w:val="single" w:color="auto" w:sz="4" w:space="0"/>
+            <w:right w:val="single" w:color="auto" w:sz="4" w:space="0"/>
+            <w:insideH w:val="single" w:color="auto" w:sz="4" w:space="0"/>
+            <w:insideV w:val="single" w:color="auto" w:sz="4" w:space="0"/>
+          </w:tblBorders>
+          <w:tblCellMar>
+            <w:top w:w="0" w:type="dxa"/>
+            <w:left w:w="10" w:type="dxa"/>
+            <w:bottom w:w="0" w:type="dxa"/>
+            <w:right w:w="10" w:type="dxa"/>
+          </w:tblCellMar>
+        </w:tblPrEx>
+        <w:tc>
+          <w:tcPr>
+            <w:tcW w:w="2058" w:type="dxa"/>
+            <w:tcBorders>
+              <w:top w:val="nil"/>
+              <w:left w:val="nil"/>
+              <w:bottom w:val="nil"/>
+              <w:right w:val="nil"/>
+            </w:tcBorders>
+            <w:shd w:val="clear" w:color="auto" w:fill="FFFFFF"/>
+            <w:vAlign w:val="center"/>
+          </w:tcPr>
+          <w:p>
+            <w:pPr>
+              <w:pStyle w:val="41"/>
+              <w:spacing w:before="93" w:after="93"/>
+              <w:rPr>
+                <w:rFonts w:hint="eastAsia"/>
+                <w:b w:val="0"/>
+                <w:color w:val="000000"/>
+                <w:lang w:eastAsia="zh-CN"/>
+              </w:rPr>
+            </w:pPr>
+            <w:r>
+              <w:rPr>
+                <w:rFonts w:hint="eastAsia"/>
+                <w:b w:val="0"/>
+                <w:color w:val="000000"/>
+                <w:lang w:eastAsia="zh-CN"/>
+              </w:rPr>
+              <w:t>云端 AI</w:t>
+            </w:r>
+          </w:p>
+        </w:tc>
+        <w:tc>
+          <w:tcPr>
+            <w:tcW w:w="4860" w:type="dxa"/>
+            <w:tcBorders>
+              <w:top w:val="nil"/>
+              <w:left w:val="nil"/>
+              <w:bottom w:val="nil"/>
+              <w:right w:val="nil"/>
+            </w:tcBorders>
+            <w:shd w:val="clear" w:color="auto" w:fill="FFFFFF"/>
+            <w:vAlign w:val="center"/>
+          </w:tcPr>
+          <w:p>
+            <w:pPr>
+              <w:pStyle w:val="41"/>
+              <w:spacing w:before="93" w:after="93"/>
+              <w:rPr>
+                <w:rFonts w:hint="eastAsia"/>
+                <w:b w:val="0"/>
+                <w:color w:val="000000"/>
+                <w:lang w:eastAsia="zh-CN"/>
+              </w:rPr>
+            </w:pPr>
+            <w:r>
+              <w:rPr>
+                <w:rFonts w:hint="eastAsia"/>
+                <w:b w:val="0"/>
+                <w:color w:val="000000"/>
+                <w:lang w:eastAsia="zh-CN"/>
+              </w:rPr>
+              <w:t>阿里云百炼</w:t>
+            </w:r>
+          </w:p>
+        </w:tc>
+        <w:tc>
+          <w:tcPr>
+            <w:tcW w:w="1408" w:type="dxa"/>
+            <w:tcBorders>
+              <w:top w:val="nil"/>
+              <w:left w:val="nil"/>
+              <w:bottom w:val="nil"/>
+              <w:right w:val="nil"/>
+            </w:tcBorders>
+            <w:shd w:val="clear" w:color="auto" w:fill="FFFFFF"/>
+            <w:vAlign w:val="center"/>
+          </w:tcPr>
+          <w:p>
+            <w:pPr>
+              <w:pStyle w:val="41"/>
+              <w:spacing w:before="93" w:after="93"/>
+              <w:rPr>
+                <w:rFonts w:hint="eastAsia"/>
+                <w:b w:val="0"/>
+                <w:color w:val="000000"/>
+                <w:lang w:eastAsia="zh-CN"/>
+              </w:rPr>
+            </w:pPr>
+            <w:r>
+              <w:rPr>
+                <w:rFonts w:hint="eastAsia"/>
+                <w:b w:val="0"/>
+                <w:color w:val="000000"/>
+                <w:lang w:eastAsia="zh-CN"/>
+              </w:rPr>
+              <w:t>qwen-vl-plus</w:t>
+            </w:r>
+          </w:p>
+        </w:tc>
+      </w:tr>
+      <w:tr>
+        <w:tblPrEx>
+          <w:tblBorders>
+            <w:top w:val="single" w:color="auto" w:sz="4" w:space="0"/>
+            <w:left w:val="single" w:color="auto" w:sz="4" w:space="0"/>
+            <w:bottom w:val="single" w:color="auto" w:sz="4" w:space="0"/>
+            <w:right w:val="single" w:color="auto" w:sz="4" w:space="0"/>
+            <w:insideH w:val="single" w:color="auto" w:sz="4" w:space="0"/>
+            <w:insideV w:val="single" w:color="auto" w:sz="4" w:space="0"/>
+          </w:tblBorders>
+          <w:tblCellMar>
+            <w:top w:w="0" w:type="dxa"/>
+            <w:left w:w="10" w:type="dxa"/>
+            <w:bottom w:w="0" w:type="dxa"/>
+            <w:right w:w="10" w:type="dxa"/>
+          </w:tblCellMar>
+        </w:tblPrEx>
+        <w:tc>
+          <w:tcPr>
+            <w:tcW w:w="2058" w:type="dxa"/>
+            <w:tcBorders>
+              <w:top w:val="nil"/>
+              <w:left w:val="nil"/>
+              <w:bottom w:val="nil"/>
+              <w:right w:val="nil"/>
+            </w:tcBorders>
+            <w:shd w:val="clear" w:color="auto" w:fill="FFFFFF"/>
+            <w:vAlign w:val="center"/>
+          </w:tcPr>
+          <w:p>
+            <w:pPr>
+              <w:pStyle w:val="41"/>
+              <w:spacing w:before="93" w:after="93"/>
+              <w:rPr>
+                <w:rFonts w:hint="eastAsia"/>
+                <w:b w:val="0"/>
+                <w:color w:val="000000"/>
+                <w:lang w:eastAsia="zh-CN"/>
+              </w:rPr>
+            </w:pPr>
+            <w:r>
+              <w:rPr>
+                <w:rFonts w:hint="eastAsia"/>
+                <w:b w:val="0"/>
+                <w:color w:val="000000"/>
+                <w:lang w:eastAsia="zh-CN"/>
+              </w:rPr>
+              <w:t>图片加载</w:t>
+            </w:r>
+          </w:p>
+        </w:tc>
+        <w:tc>
+          <w:tcPr>
+            <w:tcW w:w="4860" w:type="dxa"/>
+            <w:tcBorders>
+              <w:top w:val="nil"/>
+              <w:left w:val="nil"/>
+              <w:bottom w:val="nil"/>
+              <w:right w:val="nil"/>
+            </w:tcBorders>
+            <w:shd w:val="clear" w:color="auto" w:fill="FFFFFF"/>
+            <w:vAlign w:val="center"/>
+          </w:tcPr>
+          <w:p>
+            <w:pPr>
+              <w:pStyle w:val="41"/>
+              <w:spacing w:before="93" w:after="93"/>
+              <w:rPr>
+                <w:rFonts w:hint="eastAsia"/>
+                <w:b w:val="0"/>
+                <w:color w:val="000000"/>
+                <w:lang w:eastAsia="zh-CN"/>
+              </w:rPr>
+            </w:pPr>
+            <w:r>
+              <w:rPr>
+                <w:rFonts w:hint="eastAsia"/>
+                <w:b w:val="0"/>
+                <w:color w:val="000000"/>
+                <w:lang w:eastAsia="zh-CN"/>
+              </w:rPr>
+              <w:t>Coil</w:t>
+            </w:r>
+          </w:p>
+        </w:tc>
+        <w:tc>
+          <w:tcPr>
+            <w:tcW w:w="1408" w:type="dxa"/>
+            <w:tcBorders>
+              <w:top w:val="nil"/>
+              <w:left w:val="nil"/>
+              <w:bottom w:val="nil"/>
+              <w:right w:val="nil"/>
+            </w:tcBorders>
+            <w:shd w:val="clear" w:color="auto" w:fill="FFFFFF"/>
+            <w:vAlign w:val="center"/>
+          </w:tcPr>
+          <w:p>
+            <w:pPr>
+              <w:pStyle w:val="41"/>
+              <w:spacing w:before="93" w:after="93"/>
+              <w:rPr>
+                <w:rFonts w:hint="eastAsia"/>
+                <w:b w:val="0"/>
+                <w:color w:val="000000"/>
+                <w:lang w:eastAsia="zh-CN"/>
+              </w:rPr>
+            </w:pPr>
+            <w:r>
+              <w:rPr>
+                <w:rFonts w:hint="eastAsia"/>
+                <w:b w:val="0"/>
+                <w:color w:val="000000"/>
+                <w:lang w:eastAsia="zh-CN"/>
+              </w:rPr>
+              <w:t>2.4.0</w:t>
+            </w:r>
+          </w:p>
+        </w:tc>
+      </w:tr>
+      <w:tr>
+        <w:tblPrEx>
+          <w:tblBorders>
+            <w:top w:val="single" w:color="auto" w:sz="4" w:space="0"/>
+            <w:left w:val="single" w:color="auto" w:sz="4" w:space="0"/>
+            <w:bottom w:val="single" w:color="auto" w:sz="4" w:space="0"/>
+            <w:right w:val="single" w:color="auto" w:sz="4" w:space="0"/>
+            <w:insideH w:val="single" w:color="auto" w:sz="4" w:space="0"/>
+            <w:insideV w:val="single" w:color="auto" w:sz="4" w:space="0"/>
+          </w:tblBorders>
+          <w:tblCellMar>
+            <w:top w:w="0" w:type="dxa"/>
+            <w:left w:w="10" w:type="dxa"/>
+            <w:bottom w:w="0" w:type="dxa"/>
+            <w:right w:w="10" w:type="dxa"/>
+          </w:tblCellMar>
+        </w:tblPrEx>
+        <w:tc>
+          <w:tcPr>
+            <w:tcW w:w="2058" w:type="dxa"/>
             <w:tcBorders>
               <w:top w:val="nil"/>
               <w:left w:val="nil"/>
@@ -5413,6 +6157,7 @@
               <w:right w:val="nil"/>
             </w:tcBorders>
             <w:shd w:val="clear" w:color="auto" w:fill="FFFFFF"/>
+            <w:vAlign w:val="center"/>
           </w:tcPr>
           <w:p>
             <w:pPr>
@@ -5432,12 +6177,13 @@
                 <w:color w:val="000000"/>
                 <w:lang w:eastAsia="zh-CN"/>
               </w:rPr>
-              <w:t>场景识别</w:t>
+              <w:t>权限管理</w:t>
             </w:r>
           </w:p>
         </w:tc>
         <w:tc>
           <w:tcPr>
+            <w:tcW w:w="4860" w:type="dxa"/>
             <w:tcBorders>
               <w:top w:val="nil"/>
               <w:left w:val="nil"/>
@@ -5445,6 +6191,7 @@
               <w:right w:val="nil"/>
             </w:tcBorders>
             <w:shd w:val="clear" w:color="auto" w:fill="FFFFFF"/>
+            <w:vAlign w:val="center"/>
           </w:tcPr>
           <w:p>
             <w:pPr>
@@ -5464,12 +6211,13 @@
                 <w:color w:val="000000"/>
                 <w:lang w:eastAsia="zh-CN"/>
               </w:rPr>
-              <w:t>ML Kit Image Labeling</w:t>
+              <w:t>Accompanist</w:t>
             </w:r>
           </w:p>
         </w:tc>
         <w:tc>
           <w:tcPr>
+            <w:tcW w:w="1408" w:type="dxa"/>
             <w:tcBorders>
               <w:top w:val="nil"/>
               <w:left w:val="nil"/>
@@ -5477,6 +6225,7 @@
               <w:right w:val="nil"/>
             </w:tcBorders>
             <w:shd w:val="clear" w:color="auto" w:fill="FFFFFF"/>
+            <w:vAlign w:val="center"/>
           </w:tcPr>
           <w:p>
             <w:pPr>
@@ -5496,7 +6245,7 @@
                 <w:color w:val="000000"/>
                 <w:lang w:eastAsia="zh-CN"/>
               </w:rPr>
-              <w:t>17.0.9</w:t>
+              <w:t>0.32.0</w:t>
             </w:r>
           </w:p>
         </w:tc>
@@ -5504,6 +6253,65 @@
     </w:tbl>
     <w:p>
       <w:pPr>
+        <w:pStyle w:val="4"/>
+        <w:keepNext/>
+        <w:keepLines/>
+        <w:pageBreakBefore w:val="0"/>
+        <w:widowControl w:val="0"/>
+        <w:numPr>
+          <w:ilvl w:val="1"/>
+          <w:numId w:val="4"/>
+        </w:numPr>
+        <w:kinsoku/>
+        <w:wordWrap/>
+        <w:overflowPunct/>
+        <w:topLinePunct/>
+        <w:autoSpaceDE/>
+        <w:autoSpaceDN/>
+        <w:bidi w:val="0"/>
+        <w:adjustRightInd w:val="0"/>
+        <w:snapToGrid w:val="0"/>
+        <w:spacing w:before="468" w:after="93"/>
+        <w:textAlignment w:val="auto"/>
+        <w:rPr>
+          <w:rFonts w:hint="default" w:ascii="Arial" w:hAnsi="Arial"/>
+          <w:lang w:val="en-US" w:eastAsia="zh-CN"/>
+        </w:rPr>
+      </w:pPr>
+      <w:r>
+        <w:rPr>
+          <w:rFonts w:hint="eastAsia" w:ascii="Arial" w:hAnsi="Arial"/>
+          <w:lang w:val="en-US" w:eastAsia="zh-CN"/>
+        </w:rPr>
+        <w:t>功能模块</w:t>
+      </w:r>
+    </w:p>
+    <w:p>
+      <w:pPr>
+        <w:rPr>
+          <w:rFonts w:hint="eastAsia"/>
+          <w:lang w:eastAsia="zh-CN"/>
+        </w:rPr>
+      </w:pPr>
+    </w:p>
+    <w:p>
+      <w:pPr>
+        <w:rPr>
+          <w:rFonts w:hint="eastAsia"/>
+          <w:lang w:eastAsia="zh-CN"/>
+        </w:rPr>
+      </w:pPr>
+    </w:p>
+    <w:p>
+      <w:pPr>
+        <w:rPr>
+          <w:rFonts w:hint="eastAsia"/>
+          <w:lang w:eastAsia="zh-CN"/>
+        </w:rPr>
+      </w:pPr>
+    </w:p>
+    <w:p>
+      <w:pPr>
         <w:rPr>
           <w:rFonts w:hint="eastAsia"/>
           <w:lang w:eastAsia="zh-CN"/>
@@ -5516,6 +6324,14 @@
         </w:rPr>
         <w:br w:type="page"/>
       </w:r>
+    </w:p>
+    <w:p>
+      <w:pPr>
+        <w:rPr>
+          <w:rFonts w:hint="eastAsia"/>
+          <w:lang w:eastAsia="zh-CN"/>
+        </w:rPr>
+      </w:pPr>
     </w:p>
     <w:p>
       <w:pPr>
@@ -5778,80 +6594,97 @@
     </w:p>
     <w:p>
       <w:pPr>
+        <w:pStyle w:val="5"/>
+        <w:bidi w:val="0"/>
+        <w:rPr>
+          <w:rFonts w:hint="eastAsia"/>
+          <w:lang w:eastAsia="zh-CN"/>
+        </w:rPr>
+      </w:pPr>
+      <w:r>
+        <w:rPr>
+          <w:rFonts w:hint="eastAsia"/>
+          <w:lang w:eastAsia="zh-CN"/>
+        </w:rPr>
+        <w:t>实时 AI 场景识别与构图分析</w:t>
+      </w:r>
+    </w:p>
+    <w:p>
+      <w:pPr>
+        <w:pStyle w:val="5"/>
+        <w:bidi w:val="0"/>
+        <w:rPr>
+          <w:rFonts w:hint="eastAsia"/>
+          <w:lang w:eastAsia="zh-CN"/>
+        </w:rPr>
+      </w:pPr>
+      <w:r>
+        <w:rPr>
+          <w:rFonts w:hint="eastAsia"/>
+          <w:lang w:eastAsia="zh-CN"/>
+        </w:rPr>
+        <w:t>移动端 AI 模型优化与部署</w:t>
+      </w:r>
+    </w:p>
+    <w:p>
+      <w:pPr>
+        <w:pStyle w:val="5"/>
+        <w:bidi w:val="0"/>
+        <w:rPr>
+          <w:rFonts w:hint="eastAsia"/>
+          <w:lang w:eastAsia="zh-CN"/>
+        </w:rPr>
+      </w:pPr>
+      <w:r>
+        <w:rPr>
+          <w:rFonts w:hint="eastAsia"/>
+          <w:lang w:eastAsia="zh-CN"/>
+        </w:rPr>
+        <w:t>CameraX 预览与 AI 分析帧同步</w:t>
+      </w:r>
+    </w:p>
+    <w:p>
+      <w:pPr>
+        <w:pStyle w:val="5"/>
+        <w:bidi w:val="0"/>
+        <w:rPr>
+          <w:rFonts w:hint="eastAsia"/>
+          <w:lang w:eastAsia="zh-CN"/>
+        </w:rPr>
+      </w:pPr>
+      <w:r>
+        <w:rPr>
+          <w:rFonts w:hint="eastAsia"/>
+          <w:lang w:eastAsia="zh-CN"/>
+        </w:rPr>
+        <w:t>本地 AI 色彩增强实现</w:t>
+      </w:r>
+    </w:p>
+    <w:p>
+      <w:pPr>
+        <w:pStyle w:val="5"/>
+        <w:bidi w:val="0"/>
+        <w:rPr>
+          <w:rFonts w:hint="eastAsia"/>
+          <w:lang w:eastAsia="zh-CN"/>
+        </w:rPr>
+      </w:pPr>
+      <w:r>
+        <w:rPr>
+          <w:rFonts w:hint="eastAsia"/>
+          <w:lang w:eastAsia="zh-CN"/>
+        </w:rPr>
+        <w:t>智能裁剪算法设计</w:t>
+      </w:r>
+    </w:p>
+    <w:p>
+      <w:pPr>
         <w:pStyle w:val="3"/>
-        <w:spacing w:before="62" w:after="62"/>
-        <w:ind w:firstLine="480"/>
-        <w:rPr>
-          <w:rFonts w:hint="eastAsia"/>
-        </w:rPr>
-      </w:pPr>
-      <w:r>
-        <w:rPr>
-          <w:rFonts w:hint="eastAsia"/>
-        </w:rPr>
-        <w:t>（1）实时构图辅助：使用Canvas绘制三分法构图辅助线，结合ML Kit Face Detection检测人脸位置，根据人脸位置给出构图建议。</w:t>
-      </w:r>
-    </w:p>
-    <w:p>
-      <w:pPr>
-        <w:pStyle w:val="3"/>
-        <w:spacing w:before="62" w:after="62"/>
-        <w:ind w:firstLine="480"/>
-        <w:rPr>
-          <w:rFonts w:hint="eastAsia"/>
-        </w:rPr>
-      </w:pPr>
-      <w:r>
-        <w:rPr>
-          <w:rFonts w:hint="eastAsia"/>
-        </w:rPr>
-        <w:t>（2）场景识别：使用ML Kit Image Labeling进行实时场景分类，识别类型包括人像、风景、美食、夜景、建筑等。</w:t>
-      </w:r>
-    </w:p>
-    <w:p>
-      <w:pPr>
-        <w:pStyle w:val="3"/>
-        <w:spacing w:before="62" w:after="62"/>
-        <w:ind w:firstLine="480"/>
-        <w:rPr>
-          <w:rFonts w:hint="eastAsia"/>
-        </w:rPr>
-      </w:pPr>
-      <w:r>
-        <w:rPr>
-          <w:rFonts w:hint="eastAsia"/>
-        </w:rPr>
-        <w:t>（3）智能裁剪：使用ML Kit Object Detection检测图片主体，结合美学计算模型（三分法、黄金比例）计算最佳裁剪区域。</w:t>
-      </w:r>
-    </w:p>
-    <w:p>
-      <w:pPr>
-        <w:pStyle w:val="3"/>
-        <w:spacing w:before="62" w:after="62"/>
-        <w:ind w:firstLine="480"/>
-        <w:rPr>
-          <w:rFonts w:hint="eastAsia"/>
-        </w:rPr>
-      </w:pPr>
-      <w:r>
-        <w:rPr>
-          <w:rFonts w:hint="eastAsia"/>
-        </w:rPr>
-        <w:t>（4）AI调色：使用ONNX Runtime进行本地AI推理，输入224x224图像，输出</w:t>
-      </w:r>
-      <w:r>
-        <w:rPr>
-          <w:rFonts w:hint="eastAsia"/>
-          <w:lang w:val="en-US" w:eastAsia="zh-CN"/>
-        </w:rPr>
-        <w:t>5</w:t>
-      </w:r>
-      <w:r>
-        <w:rPr>
-          <w:rFonts w:hint="eastAsia"/>
-        </w:rPr>
-        <w:t>维调色参数（曝光、对比度、饱和度、色温、高光），参数限制在合理范围内避免过度调整。</w:t>
-      </w:r>
+        <w:rPr>
+          <w:rFonts w:hint="eastAsia"/>
+          <w:lang w:eastAsia="zh-CN"/>
+        </w:rPr>
+      </w:pPr>
     </w:p>
     <w:p>
       <w:pPr>
@@ -7180,70 +8013,86 @@
       <w:pPr>
         <w:pStyle w:val="3"/>
         <w:rPr>
-          <w:rFonts w:hint="eastAsia"/>
-        </w:rPr>
-      </w:pPr>
-      <w:r>
-        <w:rPr>
-          <w:rFonts w:hint="eastAsia"/>
-        </w:rPr>
-        <w:t>（1）【拍前辅助】理念创新：区别于传统后期修图应用，从源头提升摄影质量，帮助用户捕捉最佳瞬间。</w:t>
+          <w:rFonts w:hint="eastAsia" w:eastAsia="宋体"/>
+          <w:lang w:eastAsia="zh-CN"/>
+        </w:rPr>
+      </w:pPr>
+      <w:r>
+        <w:rPr>
+          <w:rFonts w:hint="eastAsia"/>
+        </w:rPr>
+        <w:t>（</w:t>
+      </w:r>
+      <w:r>
+        <w:rPr>
+          <w:rFonts w:hint="eastAsia"/>
+          <w:lang w:eastAsia="zh-CN"/>
+        </w:rPr>
+        <w:t>（1）【拍前辅助】理念创新：区别于传统后期修图应用，我们的产品从摄影的源头着手，通过实时AI辅助提升拍摄质量。它能在用户按下快门之前，智能分析环境光线、主体姿态和构图元素，提供最佳拍摄时机建议，从而帮助用户捕捉到更生动、更完美的瞬间，避免后期修图的繁琐，让摄影过程更智能、更高效。</w:t>
       </w:r>
     </w:p>
     <w:p>
       <w:pPr>
         <w:pStyle w:val="3"/>
         <w:rPr>
-          <w:rFonts w:hint="eastAsia"/>
-        </w:rPr>
-      </w:pPr>
-      <w:r>
-        <w:rPr>
-          <w:rFonts w:hint="eastAsia"/>
-        </w:rPr>
-        <w:t>（2）边缘AI推理优化：使用ONNX Runtime + INT8量化，在移动端实现低延迟实时处理。</w:t>
+          <w:rFonts w:hint="eastAsia" w:eastAsia="宋体"/>
+          <w:lang w:eastAsia="zh-CN"/>
+        </w:rPr>
+      </w:pPr>
+      <w:r>
+        <w:rPr>
+          <w:rFonts w:hint="eastAsia"/>
+          <w:lang w:eastAsia="zh-CN"/>
+        </w:rPr>
+        <w:t>（2）边缘AI推理优化：采用先进的ONNX Runtime框架，在移动设备上实现高效的AI模型推理。通过优化算法和硬件加速，确保在资源有限的移动端也能达到低延迟的实时处理效果，让AI辅助功能流畅无卡顿，提升用户体验，同时降低能耗，延长设备续航。</w:t>
       </w:r>
     </w:p>
     <w:p>
       <w:pPr>
         <w:pStyle w:val="3"/>
         <w:rPr>
-          <w:rFonts w:hint="eastAsia"/>
-        </w:rPr>
-      </w:pPr>
-      <w:r>
-        <w:rPr>
-          <w:rFonts w:hint="eastAsia"/>
-        </w:rPr>
-        <w:t>（3）多模型融合架构：结合场景识别、人脸检测、构图分析、色彩分析等多种AI模型，协同工作提供最佳建议。</w:t>
+          <w:rFonts w:hint="eastAsia" w:eastAsia="宋体"/>
+          <w:lang w:eastAsia="zh-CN"/>
+        </w:rPr>
+      </w:pPr>
+      <w:r>
+        <w:rPr>
+          <w:rFonts w:hint="eastAsia"/>
+          <w:lang w:eastAsia="zh-CN"/>
+        </w:rPr>
+        <w:t>（3）多模型融合架构：集成场景识别、人脸检测、构图分析、色彩分析等多种AI模型，形成一个协同工作的智能系统。这些模型相互配合，根据拍摄场景自动调整策略，提供综合性的最佳建议，如自动识别风景模式并优化色彩，或检测人像并建议最佳构图，确保每一张照片都能达到专业水准。</w:t>
       </w:r>
     </w:p>
     <w:p>
       <w:pPr>
         <w:pStyle w:val="3"/>
         <w:rPr>
-          <w:rFonts w:hint="eastAsia"/>
-        </w:rPr>
-      </w:pPr>
-      <w:r>
-        <w:rPr>
-          <w:rFonts w:hint="eastAsia"/>
-        </w:rPr>
-        <w:t>（4）隐私保护架构：纯本地化处理，照片数据不出设备，无需网络权限。</w:t>
+          <w:rFonts w:hint="eastAsia" w:eastAsia="宋体"/>
+          <w:lang w:eastAsia="zh-CN"/>
+        </w:rPr>
+      </w:pPr>
+      <w:r>
+        <w:rPr>
+          <w:rFonts w:hint="eastAsia"/>
+          <w:lang w:eastAsia="zh-CN"/>
+        </w:rPr>
+        <w:t>（4）隐私保护架构：坚持纯本地化处理原则，所有照片数据仅在用户设备内部处理，绝不传输到外部服务器。无需网络权限，确保用户隐私安全，让用户在享受AI便利的同时，完全掌控自己的数据，符合全球隐私法规要求，增强用户信任。</w:t>
       </w:r>
     </w:p>
     <w:p>
       <w:pPr>
         <w:pStyle w:val="3"/>
         <w:rPr>
-          <w:rFonts w:hint="eastAsia"/>
-        </w:rPr>
-      </w:pPr>
-      <w:r>
-        <w:rPr>
-          <w:rFonts w:hint="eastAsia"/>
-        </w:rPr>
-        <w:t>（5）自然增强美学：追求自然真实的影像观感，AI参数建议控制在合理范围内，避免过度处理。</w:t>
+          <w:rFonts w:hint="eastAsia" w:eastAsia="宋体"/>
+          <w:lang w:eastAsia="zh-CN"/>
+        </w:rPr>
+      </w:pPr>
+      <w:r>
+        <w:rPr>
+          <w:rFonts w:hint="eastAsia"/>
+          <w:lang w:eastAsia="zh-CN"/>
+        </w:rPr>
+        <w:t>（5）自然增强美学：注重影像的自然真实感，AI生成的参数建议严格控制在合理范围内。通过智能算法平衡曝光、对比度和色彩，避免过度处理导致的失真，使照片看起来既美观又保持原汁原味，满足用户对高品质影像的追求，同时培养健康的审美习惯。</w:t>
       </w:r>
     </w:p>
     <w:p>
@@ -7259,28 +8108,129 @@
         <w:rPr>
           <w:rFonts w:hint="eastAsia"/>
         </w:rPr>
-        <w:t>应用推广</w:t>
+        <w:t>应用</w:t>
+      </w:r>
+      <w:r>
+        <w:rPr>
+          <w:rFonts w:hint="eastAsia"/>
+          <w:lang w:val="en-US" w:eastAsia="zh-CN"/>
+        </w:rPr>
+        <w:t>价值与</w:t>
+      </w:r>
+      <w:r>
+        <w:rPr>
+          <w:rFonts w:hint="eastAsia"/>
+        </w:rPr>
+        <w:t>推广</w:t>
       </w:r>
       <w:bookmarkEnd w:id="33"/>
     </w:p>
     <w:p>
       <w:pPr>
         <w:pStyle w:val="3"/>
-        <w:spacing w:before="62" w:after="62"/>
-        <w:ind w:firstLine="480"/>
-      </w:pPr>
-      <w:r>
-        <w:t>本作品的目标用户群体包括：摄影初学者（需要构图指导和参数建议）、社交媒体用户（追求快速产出高质量照片）、旅行爱好者（希望记录美好瞬间但缺乏专业技巧）、美食博主（需要快速拍摄并美化食物照片）。</w:t>
-      </w:r>
-    </w:p>
-    <w:p>
-      <w:pPr>
-        <w:pStyle w:val="3"/>
-        <w:spacing w:before="62" w:after="62"/>
-        <w:ind w:firstLine="480"/>
-      </w:pPr>
-      <w:r>
-        <w:t>推广策略：（1）免费+增值服务模式，基础功能免费，高级AI功能付费；（2）技术授权给手机厂商和相机APP开发者；（3）上线应用商店，积累用户。</w:t>
+        <w:ind w:left="0" w:leftChars="0" w:firstLine="420" w:firstLineChars="0"/>
+        <w:rPr>
+          <w:rFonts w:hint="eastAsia"/>
+          <w:lang w:eastAsia="zh-CN"/>
+        </w:rPr>
+      </w:pPr>
+      <w:r>
+        <w:rPr>
+          <w:rFonts w:hint="eastAsia"/>
+          <w:lang w:eastAsia="zh-CN"/>
+        </w:rPr>
+        <w:t>该产品的目标用户涵盖摄影新手（寻求构图与参数指导）、社交媒体使用者（追求高效产出精美图片）、旅行爱好者（渴望记录难忘瞬间但技巧有限）以及美食博主（需要快速拍摄并优化食物照片）。</w:t>
+      </w:r>
+      <w:r>
+        <w:rPr>
+          <w:rFonts w:hint="eastAsia"/>
+          <w:lang w:eastAsia="zh-CN"/>
+        </w:rPr>
+        <w:t>其</w:t>
+      </w:r>
+      <w:r>
+        <w:rPr>
+          <w:rFonts w:hint="eastAsia"/>
+          <w:lang w:eastAsia="zh-CN"/>
+        </w:rPr>
+        <w:t>核</w:t>
+      </w:r>
+      <w:r>
+        <w:rPr>
+          <w:rFonts w:hint="eastAsia"/>
+          <w:lang w:eastAsia="zh-CN"/>
+        </w:rPr>
+        <w:t>心</w:t>
+      </w:r>
+      <w:r>
+        <w:rPr>
+          <w:rFonts w:hint="eastAsia"/>
+          <w:lang w:eastAsia="zh-CN"/>
+        </w:rPr>
+        <w:t>在</w:t>
+      </w:r>
+      <w:r>
+        <w:rPr>
+          <w:rFonts w:hint="eastAsia"/>
+          <w:lang w:eastAsia="zh-CN"/>
+        </w:rPr>
+        <w:t>于</w:t>
+      </w:r>
+      <w:r>
+        <w:rPr>
+          <w:rFonts w:hint="eastAsia"/>
+          <w:lang w:eastAsia="zh-CN"/>
+        </w:rPr>
+        <w:t>降低摄影难度，使普通用户也能创作专业级影像；同时通过实时指导提升构图审美，培养艺术感知。隐私保护方案灵活：本地功能无需联网即可运行，云端服务则由用户自主</w:t>
+      </w:r>
+      <w:r>
+        <w:rPr>
+          <w:rFonts w:hint="eastAsia"/>
+          <w:lang w:eastAsia="zh-CN"/>
+        </w:rPr>
+        <w:t>控</w:t>
+      </w:r>
+      <w:r>
+        <w:rPr>
+          <w:rFonts w:hint="eastAsia"/>
+          <w:lang w:eastAsia="zh-CN"/>
+        </w:rPr>
+        <w:t>制</w:t>
+      </w:r>
+      <w:r>
+        <w:rPr>
+          <w:rFonts w:hint="eastAsia"/>
+          <w:lang w:eastAsia="zh-CN"/>
+        </w:rPr>
+        <w:t>启</w:t>
+      </w:r>
+      <w:r>
+        <w:rPr>
+          <w:rFonts w:hint="eastAsia"/>
+          <w:lang w:eastAsia="zh-CN"/>
+        </w:rPr>
+        <w:t>用</w:t>
+      </w:r>
+      <w:r>
+        <w:rPr>
+          <w:rFonts w:hint="eastAsia"/>
+          <w:lang w:eastAsia="zh-CN"/>
+        </w:rPr>
+        <w:t>。</w:t>
+      </w:r>
+      <w:r>
+        <w:rPr>
+          <w:rFonts w:hint="eastAsia"/>
+          <w:lang w:val="en-US" w:eastAsia="zh-CN"/>
+        </w:rPr>
+        <w:tab/>
+      </w:r>
+      <w:r>
+        <w:rPr>
+          <w:rFonts w:hint="eastAsia"/>
+          <w:lang w:eastAsia="zh-CN"/>
+        </w:rPr>
+        <w:t>推广策略包括：（1）采用免费基础功能与付费高级AI服务的增值模式；（2）向手机厂商及相机应用开发者进行技术授权；（3）通过应用商店上线，逐步积累用户资源。</w:t>
       </w:r>
     </w:p>
     <w:p>
@@ -7303,34 +8253,171 @@
     <w:p>
       <w:pPr>
         <w:pStyle w:val="3"/>
-        <w:spacing w:before="62" w:after="62"/>
-        <w:ind w:firstLine="480"/>
-      </w:pPr>
-      <w:r>
-        <w:t>短期目标（比赛期间）：完成所有核心功能开发，达到性能指标要求，准备完整的比赛材料。</w:t>
+        <w:rPr>
+          <w:rFonts w:hint="eastAsia"/>
+          <w:lang w:eastAsia="zh-CN"/>
+        </w:rPr>
+      </w:pPr>
+      <w:r>
+        <w:rPr>
+          <w:rFonts w:hint="eastAsia"/>
+          <w:lang w:eastAsia="zh-CN"/>
+        </w:rPr>
+        <w:t>CameraX-AI智能摄影助手将持续致力于通过AI技术赋能摄影创作，打造一个开放、智能、专业的摄影生态系统，让每一位用户都能轻松拍出专业级作品，为移动摄影领域带来革命性的改变。</w:t>
+      </w:r>
+    </w:p>
+    <w:p>
+      <w:pPr>
+        <w:pStyle w:val="5"/>
+        <w:bidi w:val="0"/>
+        <w:rPr>
+          <w:rFonts w:hint="eastAsia"/>
+          <w:lang w:eastAsia="zh-CN"/>
+        </w:rPr>
+      </w:pPr>
+      <w:r>
+        <w:rPr>
+          <w:rFonts w:hint="eastAsia"/>
+          <w:lang w:eastAsia="zh-CN"/>
+        </w:rPr>
+        <w:t>短期目标（6-12个月）</w:t>
       </w:r>
     </w:p>
     <w:p>
       <w:pPr>
         <w:pStyle w:val="3"/>
-        <w:spacing w:before="62" w:after="62"/>
-        <w:ind w:firstLine="480"/>
-      </w:pPr>
-      <w:r>
-        <w:t>中期目标（赛后6个月）：上线应用商店，积累1万+活跃用户，持续迭代优化，探索商业化模式。</w:t>
+        <w:rPr>
+          <w:rFonts w:hint="eastAsia" w:eastAsia="宋体"/>
+          <w:lang w:eastAsia="zh-CN"/>
+        </w:rPr>
+      </w:pPr>
+      <w:r>
+        <w:rPr>
+          <w:rFonts w:hint="eastAsia"/>
+          <w:lang w:eastAsia="zh-CN"/>
+        </w:rPr>
+        <w:t>进一步优化ONNX模型的推理性能，将AI分析延迟从当前150ms降至100ms以下；完善Bitmap复用池机制，降低内存占用，增强低端设备的兼容性。实现智能帧率控制，根据设备性能自动调节AI分析频率；优化云端API调用策略，构建智能网络判断与降级机制，确保在各类网络环境下均能提供流畅的用户体验。</w:t>
       </w:r>
     </w:p>
     <w:p>
       <w:pPr>
         <w:pStyle w:val="3"/>
-        <w:spacing w:before="62" w:after="62"/>
-        <w:ind w:firstLine="480"/>
-      </w:pPr>
-      <w:r>
-        <w:t>长期目标（1-2年）：成为领先的移动摄影辅助应用，拓展到iOS平台，开放API给第三方开发者，构建摄影爱好者社区。</w:t>
-      </w:r>
-    </w:p>
-    <w:p>
+        <w:rPr>
+          <w:rFonts w:hint="eastAsia" w:eastAsia="宋体"/>
+          <w:lang w:eastAsia="zh-CN"/>
+        </w:rPr>
+      </w:pPr>
+      <w:r>
+        <w:rPr>
+          <w:rFonts w:hint="eastAsia"/>
+          <w:lang w:eastAsia="zh-CN"/>
+        </w:rPr>
+        <w:t>新增对角线构图、框架构图、黄金分割构图等多种构图模式；扩展场景识别类型，支持日落、星空、城市夜景等更多专业摄影场景。新增视频拍摄支持，实现实时视频构图指导与智能剪辑功能；优化UI交互体验，新增手势操作与个性化设置选项，全面提升用户使用感受。</w:t>
+      </w:r>
+    </w:p>
+    <w:p>
+      <w:pPr>
+        <w:pStyle w:val="3"/>
+        <w:rPr>
+          <w:rFonts w:hint="eastAsia"/>
+          <w:lang w:eastAsia="zh-CN"/>
+        </w:rPr>
+      </w:pPr>
+      <w:r>
+        <w:rPr>
+          <w:rFonts w:hint="eastAsia"/>
+          <w:lang w:eastAsia="zh-CN"/>
+        </w:rPr>
+        <w:t>开发iOS版本，实现跨平台体验统一；推出Web端在线体验版本，支持浏览器快速试用；建立开发者API，允许第三方应用集成AI摄影能力，逐步构建开放的生态系统。</w:t>
+      </w:r>
+    </w:p>
+    <w:p>
+      <w:pPr>
+        <w:pStyle w:val="5"/>
+        <w:bidi w:val="0"/>
+        <w:rPr>
+          <w:rFonts w:hint="eastAsia"/>
+          <w:lang w:eastAsia="zh-CN"/>
+        </w:rPr>
+      </w:pPr>
+      <w:r>
+        <w:rPr>
+          <w:rFonts w:hint="eastAsia"/>
+          <w:lang w:eastAsia="zh-CN"/>
+        </w:rPr>
+        <w:t>长期愿景（1-3年）</w:t>
+      </w:r>
+    </w:p>
+    <w:p>
+      <w:pPr>
+        <w:pStyle w:val="3"/>
+        <w:rPr>
+          <w:rFonts w:hint="eastAsia" w:eastAsia="宋体"/>
+          <w:lang w:eastAsia="zh-CN"/>
+        </w:rPr>
+      </w:pPr>
+      <w:r>
+        <w:rPr>
+          <w:rFonts w:hint="eastAsia"/>
+          <w:lang w:eastAsia="zh-CN"/>
+        </w:rPr>
+        <w:t>打造开放的摄影AI工具集，涵盖模型训练、部署与推理的全套解决方案；建立开发者社区，鼓励用户贡献自定义模型与构图规则；开发插件系统，支持第三方功能扩展，最终形成完整的摄影AI生态体系。</w:t>
+      </w:r>
+      <w:bookmarkStart w:id="36" w:name="_GoBack"/>
+      <w:bookmarkEnd w:id="36"/>
+    </w:p>
+    <w:p>
+      <w:pPr>
+        <w:pStyle w:val="3"/>
+        <w:rPr>
+          <w:rFonts w:hint="eastAsia" w:eastAsia="宋体"/>
+          <w:lang w:eastAsia="zh-CN"/>
+        </w:rPr>
+      </w:pPr>
+      <w:r>
+        <w:rPr>
+          <w:rFonts w:hint="eastAsia"/>
+          <w:lang w:eastAsia="zh-CN"/>
+        </w:rPr>
+        <w:t>支持RAW格式处理，配备专业级调色工具，开发批量处理功能，全面满足专业摄影师的工作流需求；推出企业版，为内容创作团队提供定制化AI摄影解决方案；开发教育版，为摄影教学提供智能辅助工具，进一步拓展专业市场。</w:t>
+      </w:r>
+    </w:p>
+    <w:p>
+      <w:pPr>
+        <w:pStyle w:val="3"/>
+        <w:rPr>
+          <w:rFonts w:hint="eastAsia" w:eastAsia="宋体"/>
+          <w:lang w:eastAsia="zh-CN"/>
+        </w:rPr>
+      </w:pPr>
+      <w:r>
+        <w:rPr>
+          <w:rFonts w:hint="eastAsia"/>
+          <w:lang w:eastAsia="zh-CN"/>
+        </w:rPr>
+        <w:t>构建基于用户反馈闭环的自适应进化智能体，实现数据驱动下模型的持续迭代与自主优化；探索生成式AI在摄影领域的创新应用，如智能场景重构与风格迁移；开发个性化AI摄影顾问，依据用户拍摄习惯提供定制化建议。</w:t>
+      </w:r>
+    </w:p>
+    <w:p>
+      <w:pPr>
+        <w:pStyle w:val="3"/>
+        <w:rPr>
+          <w:rFonts w:hint="eastAsia" w:eastAsia="宋体"/>
+          <w:lang w:eastAsia="zh-CN"/>
+        </w:rPr>
+      </w:pPr>
+      <w:r>
+        <w:rPr>
+          <w:rFonts w:hint="eastAsia"/>
+          <w:lang w:eastAsia="zh-CN"/>
+        </w:rPr>
+        <w:t>降低摄影门槛，让更多人畅享专业级摄影体验；推动移动摄影技术标准的发展，引领行业创新潮流；促进AI与传统摄影艺术的深度融合，创造全新的艺术表达形式；为视觉内容创作行业提供智能化解决方案，提升内容生产效率，最终产生广泛的社会价值与行业影响力。</w:t>
+      </w:r>
+    </w:p>
+    <w:p>
+      <w:pPr>
+        <w:pStyle w:val="3"/>
+      </w:pPr>
       <w:r>
         <w:br w:type="page"/>
       </w:r>

</xml_diff>

<commit_message>
Update project with UI automation tests and composition engine improvements
</commit_message>
<xml_diff>
--- a/docs/report.docx
+++ b/docs/report.docx
@@ -4277,49 +4277,6 @@
           <w:lang w:eastAsia="zh-CN"/>
         </w:rPr>
       </w:pPr>
-      <w:r>
-        <w:rPr>
-          <w:rFonts w:hint="eastAsia" w:eastAsia="宋体"/>
-          <w:lang w:eastAsia="zh-CN"/>
-        </w:rPr>
-        <w:drawing>
-          <wp:inline distT="0" distB="0" distL="114300" distR="114300">
-            <wp:extent cx="5610860" cy="2360295"/>
-            <wp:effectExtent l="0" t="0" r="8890" b="1905"/>
-            <wp:docPr id="6" name="图片 6" descr="tongyi-mermaid-2026-04-08-001235"/>
-            <wp:cNvGraphicFramePr>
-              <a:graphicFrameLocks xmlns:a="http://schemas.openxmlformats.org/drawingml/2006/main" noChangeAspect="1"/>
-            </wp:cNvGraphicFramePr>
-            <a:graphic xmlns:a="http://schemas.openxmlformats.org/drawingml/2006/main">
-              <a:graphicData uri="http://schemas.openxmlformats.org/drawingml/2006/picture">
-                <pic:pic xmlns:pic="http://schemas.openxmlformats.org/drawingml/2006/picture">
-                  <pic:nvPicPr>
-                    <pic:cNvPr id="6" name="图片 6" descr="tongyi-mermaid-2026-04-08-001235"/>
-                    <pic:cNvPicPr>
-                      <a:picLocks noChangeAspect="1"/>
-                    </pic:cNvPicPr>
-                  </pic:nvPicPr>
-                  <pic:blipFill>
-                    <a:blip r:embed="rId7"/>
-                    <a:stretch>
-                      <a:fillRect/>
-                    </a:stretch>
-                  </pic:blipFill>
-                  <pic:spPr>
-                    <a:xfrm>
-                      <a:off x="0" y="0"/>
-                      <a:ext cx="5610860" cy="2360295"/>
-                    </a:xfrm>
-                    <a:prstGeom prst="rect">
-                      <a:avLst/>
-                    </a:prstGeom>
-                  </pic:spPr>
-                </pic:pic>
-              </a:graphicData>
-            </a:graphic>
-          </wp:inline>
-        </w:drawing>
-      </w:r>
     </w:p>
     <w:p>
       <w:pPr>
@@ -4361,7 +4318,33 @@
         <w:rPr>
           <w:rFonts w:hint="eastAsia"/>
         </w:rPr>
-        <w:t>本系统采用分层架构设计，包括UI层、业务逻辑层和AI与图像处理层。UI层使用Jetpack Compose实现声明式UI，遵循Material Design 3设计规范。业务逻辑层使用ViewModel管理UI状态，使用Coroutines处理异步操作。AI层使用ONNX Runtime进行模型推理，结合ML Kit实现场景识别和人脸检测</w:t>
+        <w:t>本系统采用</w:t>
+      </w:r>
+      <w:r>
+        <w:rPr>
+          <w:rFonts w:hint="eastAsia"/>
+          <w:lang w:val="en-US" w:eastAsia="zh-CN"/>
+        </w:rPr>
+        <w:t>的</w:t>
+      </w:r>
+      <w:r>
+        <w:rPr>
+          <w:rFonts w:hint="eastAsia"/>
+        </w:rPr>
+        <w:t>分层架构设计</w:t>
+      </w:r>
+      <w:r>
+        <w:rPr>
+          <w:rFonts w:hint="eastAsia"/>
+          <w:lang w:val="en-US" w:eastAsia="zh-CN"/>
+        </w:rPr>
+        <w:t>如图1所示</w:t>
+      </w:r>
+      <w:r>
+        <w:rPr>
+          <w:rFonts w:hint="eastAsia"/>
+        </w:rPr>
+        <w:t>，包括UI层、业务逻辑层和AI与图像处理层。UI层使用Jetpack Compose实现声明式UI，遵循Material Design 3设计规范。业务逻辑层使用ViewModel管理UI状态，使用Coroutines处理异步操作。AI层使用ONNX Runtime进行模型推理，结合ML Kit实现场景识别和人脸检测</w:t>
       </w:r>
       <w:r>
         <w:rPr>
@@ -4417,12 +4400,12 @@
             <v:path/>
             <v:fill on="f" focussize="0,0"/>
             <v:stroke on="f"/>
-            <v:imagedata r:id="rId9" o:title=""/>
+            <v:imagedata r:id="rId8" o:title=""/>
             <o:lock v:ext="edit" aspectratio="f"/>
             <w10:wrap type="none"/>
             <w10:anchorlock/>
           </v:shape>
-          <o:OLEObject Type="Embed" ProgID="Visio.Drawing.15" ShapeID="_x0000_i1025" DrawAspect="Content" ObjectID="_1468075725" r:id="rId8">
+          <o:OLEObject Type="Embed" ProgID="Visio.Drawing.15" ShapeID="_x0000_i1025" DrawAspect="Content" ObjectID="_1468075725" r:id="rId7">
             <o:LockedField>false</o:LockedField>
           </o:OLEObject>
         </w:object>
@@ -4577,8 +4560,8 @@
         <w:spacing w:before="62" w:after="62"/>
         <w:ind w:firstLine="480"/>
         <w:rPr>
-          <w:rFonts w:hint="eastAsia"/>
-          <w:lang w:eastAsia="zh-CN"/>
+          <w:rFonts w:hint="default"/>
+          <w:lang w:val="en-US" w:eastAsia="zh-CN"/>
         </w:rPr>
       </w:pPr>
       <w:r>
@@ -4588,65 +4571,117 @@
         </w:rPr>
         <w:t>（3）AI与图像处理层：集成ML Kit（Image Labeling场景识别、Face Detection人脸检测、Object Detection对象检测）、ONNX Runtime（MobileNetV2色彩增强模型推理，5维参数输出）、OpenCV 4.9（边缘检测、水平线检测、对称性分析、引导线检测、前景区域检测、色彩分布分析）、OpenGL ES（GLES20/GLES30，HDR后处理管线）。采用双轨AI架构，本地轻量化模型负责实时性要求高的功能，云端大模型（阿里云百炼qwen-vl-plus）提供深度场景理解和专业摄影建议。</w:t>
       </w:r>
-    </w:p>
-    <w:p>
-      <w:pPr>
-        <w:pStyle w:val="4"/>
-        <w:keepNext/>
-        <w:keepLines/>
-        <w:pageBreakBefore w:val="0"/>
-        <w:widowControl w:val="0"/>
-        <w:numPr>
-          <w:numId w:val="4"/>
-        </w:numPr>
-        <w:kinsoku/>
-        <w:wordWrap/>
-        <w:overflowPunct/>
-        <w:topLinePunct/>
-        <w:autoSpaceDE/>
-        <w:autoSpaceDN/>
-        <w:bidi w:val="0"/>
-        <w:adjustRightInd w:val="0"/>
-        <w:snapToGrid w:val="0"/>
-        <w:spacing w:before="468" w:after="93"/>
-        <w:textAlignment w:val="auto"/>
-        <w:rPr>
-          <w:rFonts w:hint="eastAsia" w:ascii="Arial" w:hAnsi="Arial"/>
-          <w:lang w:eastAsia="zh-CN"/>
-        </w:rPr>
-      </w:pPr>
-      <w:bookmarkStart w:id="12" w:name="_Toc10577"/>
-      <w:bookmarkStart w:id="13" w:name="_Toc5241"/>
-      <w:r>
-        <w:rPr>
-          <w:rFonts w:hint="eastAsia" w:ascii="Arial" w:hAnsi="Arial"/>
-          <w:lang w:eastAsia="zh-CN"/>
-        </w:rPr>
-        <w:t>核心技术</w:t>
-      </w:r>
-      <w:bookmarkEnd w:id="12"/>
-      <w:bookmarkEnd w:id="13"/>
+      <w:r>
+        <w:rPr>
+          <w:rFonts w:hint="eastAsia"/>
+          <w:lang w:val="en-US" w:eastAsia="zh-CN"/>
+        </w:rPr>
+        <w:t>如图2所示：</w:t>
+      </w:r>
+    </w:p>
+    <w:p>
+      <w:pPr>
+        <w:pStyle w:val="3"/>
+        <w:spacing w:before="62" w:after="62"/>
+        <w:ind w:firstLine="480"/>
+        <w:rPr>
+          <w:rFonts w:hint="eastAsia"/>
+          <w:lang w:eastAsia="zh-CN"/>
+        </w:rPr>
+      </w:pPr>
     </w:p>
     <w:p>
       <w:pPr>
         <w:pStyle w:val="3"/>
         <w:numPr>
-          <w:ilvl w:val="0"/>
-          <w:numId w:val="5"/>
+          <w:numId w:val="0"/>
         </w:numPr>
         <w:spacing w:before="62" w:after="62"/>
-        <w:ind w:firstLine="480"/>
-        <w:rPr>
-          <w:rFonts w:hint="eastAsia"/>
-          <w:lang w:eastAsia="zh-CN"/>
-        </w:rPr>
-      </w:pPr>
-      <w:r>
-        <w:rPr>
-          <w:rFonts w:hint="eastAsia"/>
-          <w:lang w:eastAsia="zh-CN"/>
-        </w:rPr>
-        <w:t>边缘AI推理优化：使用ONNX Runtime + 模型量化（INT8），推理延迟&lt;200ms，CPU占用&lt;30%。</w:t>
+        <w:rPr>
+          <w:rFonts w:hint="eastAsia"/>
+          <w:lang w:eastAsia="zh-CN"/>
+        </w:rPr>
+      </w:pPr>
+      <w:r>
+        <w:rPr>
+          <w:rFonts w:hint="eastAsia"/>
+          <w:lang w:eastAsia="zh-CN"/>
+        </w:rPr>
+        <w:drawing>
+          <wp:inline distT="0" distB="0" distL="114300" distR="114300">
+            <wp:extent cx="5610860" cy="2360295"/>
+            <wp:effectExtent l="0" t="0" r="8890" b="1905"/>
+            <wp:docPr id="6" name="图片 6" descr="tongyi-mermaid-2026-04-08-001235"/>
+            <wp:cNvGraphicFramePr>
+              <a:graphicFrameLocks xmlns:a="http://schemas.openxmlformats.org/drawingml/2006/main" noChangeAspect="1"/>
+            </wp:cNvGraphicFramePr>
+            <a:graphic xmlns:a="http://schemas.openxmlformats.org/drawingml/2006/main">
+              <a:graphicData uri="http://schemas.openxmlformats.org/drawingml/2006/picture">
+                <pic:pic xmlns:pic="http://schemas.openxmlformats.org/drawingml/2006/picture">
+                  <pic:nvPicPr>
+                    <pic:cNvPr id="6" name="图片 6" descr="tongyi-mermaid-2026-04-08-001235"/>
+                    <pic:cNvPicPr>
+                      <a:picLocks noChangeAspect="1"/>
+                    </pic:cNvPicPr>
+                  </pic:nvPicPr>
+                  <pic:blipFill>
+                    <a:blip r:embed="rId9"/>
+                    <a:stretch>
+                      <a:fillRect/>
+                    </a:stretch>
+                  </pic:blipFill>
+                  <pic:spPr>
+                    <a:xfrm>
+                      <a:off x="0" y="0"/>
+                      <a:ext cx="5610860" cy="2360295"/>
+                    </a:xfrm>
+                    <a:prstGeom prst="rect">
+                      <a:avLst/>
+                    </a:prstGeom>
+                  </pic:spPr>
+                </pic:pic>
+              </a:graphicData>
+            </a:graphic>
+          </wp:inline>
+        </w:drawing>
+      </w:r>
+    </w:p>
+    <w:p>
+      <w:pPr>
+        <w:pStyle w:val="12"/>
+        <w:numPr>
+          <w:numId w:val="0"/>
+        </w:numPr>
+        <w:spacing w:before="62" w:after="62"/>
+        <w:rPr>
+          <w:rFonts w:hint="default" w:eastAsia="宋体"/>
+          <w:lang w:val="en-US" w:eastAsia="zh-CN"/>
+        </w:rPr>
+      </w:pPr>
+      <w:r>
+        <w:t xml:space="preserve">图 </w:t>
+      </w:r>
+      <w:r>
+        <w:fldChar w:fldCharType="begin"/>
+      </w:r>
+      <w:r>
+        <w:instrText xml:space="preserve"> SEQ 图 \* ARABIC </w:instrText>
+      </w:r>
+      <w:r>
+        <w:fldChar w:fldCharType="separate"/>
+      </w:r>
+      <w:r>
+        <w:t>2</w:t>
+      </w:r>
+      <w:r>
+        <w:fldChar w:fldCharType="end"/>
+      </w:r>
+      <w:r>
+        <w:rPr>
+          <w:rFonts w:hint="eastAsia"/>
+          <w:lang w:val="en-US" w:eastAsia="zh-CN"/>
+        </w:rPr>
+        <w:t xml:space="preserve">  构图建议数据流程图</w:t>
       </w:r>
     </w:p>
     <w:p>
@@ -4707,42 +4742,6 @@
     </w:p>
     <w:p>
       <w:pPr>
-        <w:pStyle w:val="3"/>
-        <w:spacing w:before="62" w:after="62"/>
-        <w:ind w:firstLine="480"/>
-        <w:rPr>
-          <w:rFonts w:hint="eastAsia"/>
-          <w:lang w:eastAsia="zh-CN"/>
-        </w:rPr>
-      </w:pPr>
-      <w:r>
-        <w:rPr>
-          <w:rFonts w:hint="eastAsia"/>
-          <w:lang w:eastAsia="zh-CN"/>
-        </w:rPr>
-        <w:t>（2）多模型融合架构：结合场景识别、人脸检测、构图分析、色彩分析等多种AI模型，协同工作提供最佳建议。</w:t>
-      </w:r>
-    </w:p>
-    <w:p>
-      <w:pPr>
-        <w:pStyle w:val="3"/>
-        <w:spacing w:before="62" w:after="62"/>
-        <w:ind w:firstLine="480"/>
-        <w:rPr>
-          <w:rFonts w:hint="eastAsia"/>
-          <w:lang w:eastAsia="zh-CN"/>
-        </w:rPr>
-      </w:pPr>
-      <w:r>
-        <w:rPr>
-          <w:rFonts w:hint="eastAsia"/>
-          <w:lang w:eastAsia="zh-CN"/>
-        </w:rPr>
-        <w:t>（3）性能优化策略：帧率自适应控制（2-5 FPS智能调节），图片压缩（640x480预览分析，224x224模型输入），Bitmap复用池减少内存分配。</w:t>
-      </w:r>
-    </w:p>
-    <w:p>
-      <w:pPr>
         <w:pStyle w:val="4"/>
         <w:keepNext/>
         <w:keepLines/>
@@ -4767,8 +4766,8 @@
           <w:lang w:eastAsia="zh-CN"/>
         </w:rPr>
       </w:pPr>
-      <w:bookmarkStart w:id="14" w:name="_Toc25925"/>
-      <w:bookmarkStart w:id="15" w:name="_Toc7708"/>
+      <w:bookmarkStart w:id="12" w:name="_Toc25925"/>
+      <w:bookmarkStart w:id="13" w:name="_Toc7708"/>
       <w:r>
         <w:rPr>
           <w:rFonts w:hint="eastAsia" w:ascii="Arial" w:hAnsi="Arial"/>
@@ -4776,8 +4775,8 @@
         </w:rPr>
         <w:t>技术选型</w:t>
       </w:r>
-      <w:bookmarkEnd w:id="14"/>
-      <w:bookmarkEnd w:id="15"/>
+      <w:bookmarkEnd w:id="12"/>
+      <w:bookmarkEnd w:id="13"/>
     </w:p>
     <w:p>
       <w:pPr>
@@ -4858,9 +4857,9 @@
         </w:tblPrEx>
         <w:tc>
           <w:tcPr>
+            <w:tcW w:w="2058" w:type="dxa"/>
             <w:tcBorders>
               <w:top w:val="single" w:color="000000" w:sz="12" w:space="0"/>
-              <w:left w:val="nil"/>
               <w:bottom w:val="single" w:color="000000" w:sz="4" w:space="0"/>
               <w:right w:val="nil"/>
               <w:tl2br w:val="nil"/>
@@ -4873,16 +4872,12 @@
               <w:spacing w:before="93" w:after="93"/>
               <w:rPr>
                 <w:rFonts w:hint="eastAsia"/>
-                <w:b w:val="0"/>
-                <w:color w:val="000000"/>
                 <w:lang w:eastAsia="zh-CN"/>
               </w:rPr>
             </w:pPr>
             <w:r>
               <w:rPr>
                 <w:rFonts w:hint="eastAsia"/>
-                <w:b w:val="0"/>
-                <w:color w:val="000000"/>
                 <w:lang w:eastAsia="zh-CN"/>
               </w:rPr>
               <w:t>类别</w:t>
@@ -4891,6 +4886,7 @@
         </w:tc>
         <w:tc>
           <w:tcPr>
+            <w:tcW w:w="4860" w:type="dxa"/>
             <w:tcBorders>
               <w:top w:val="single" w:color="000000" w:sz="12" w:space="0"/>
               <w:left w:val="nil"/>
@@ -4905,16 +4901,12 @@
               <w:spacing w:before="93" w:after="93"/>
               <w:rPr>
                 <w:rFonts w:hint="eastAsia"/>
-                <w:b w:val="0"/>
-                <w:color w:val="000000"/>
                 <w:lang w:eastAsia="zh-CN"/>
               </w:rPr>
             </w:pPr>
             <w:r>
               <w:rPr>
                 <w:rFonts w:hint="eastAsia"/>
-                <w:b w:val="0"/>
-                <w:color w:val="000000"/>
                 <w:lang w:eastAsia="zh-CN"/>
               </w:rPr>
               <w:t>技术</w:t>
@@ -4937,16 +4929,12 @@
               <w:spacing w:before="93" w:after="93"/>
               <w:rPr>
                 <w:rFonts w:hint="eastAsia"/>
-                <w:b w:val="0"/>
-                <w:color w:val="000000"/>
                 <w:lang w:eastAsia="zh-CN"/>
               </w:rPr>
             </w:pPr>
             <w:r>
               <w:rPr>
                 <w:rFonts w:hint="eastAsia"/>
-                <w:b w:val="0"/>
-                <w:color w:val="000000"/>
                 <w:lang w:eastAsia="zh-CN"/>
               </w:rPr>
               <w:t>版本</w:t>
@@ -4973,6 +4961,35 @@
         </w:tblPrEx>
         <w:tc>
           <w:tcPr>
+            <w:tcW w:w="2058" w:type="dxa"/>
+            <w:tcBorders>
+              <w:top w:val="single" w:color="000000" w:sz="4" w:space="0"/>
+              <w:bottom w:val="nil"/>
+              <w:right w:val="nil"/>
+            </w:tcBorders>
+            <w:shd w:val="clear" w:color="auto" w:fill="FFFFFF"/>
+          </w:tcPr>
+          <w:p>
+            <w:pPr>
+              <w:pStyle w:val="41"/>
+              <w:spacing w:before="93" w:after="93"/>
+              <w:rPr>
+                <w:rFonts w:hint="eastAsia"/>
+                <w:lang w:eastAsia="zh-CN"/>
+              </w:rPr>
+            </w:pPr>
+            <w:r>
+              <w:rPr>
+                <w:rFonts w:hint="eastAsia"/>
+                <w:lang w:eastAsia="zh-CN"/>
+              </w:rPr>
+              <w:t>开发语言</w:t>
+            </w:r>
+          </w:p>
+        </w:tc>
+        <w:tc>
+          <w:tcPr>
+            <w:tcW w:w="4860" w:type="dxa"/>
             <w:tcBorders>
               <w:top w:val="single" w:color="000000" w:sz="4" w:space="0"/>
               <w:left w:val="nil"/>
@@ -4987,48 +5004,12 @@
               <w:spacing w:before="93" w:after="93"/>
               <w:rPr>
                 <w:rFonts w:hint="eastAsia"/>
-                <w:b w:val="0"/>
-                <w:color w:val="000000"/>
                 <w:lang w:eastAsia="zh-CN"/>
               </w:rPr>
             </w:pPr>
             <w:r>
               <w:rPr>
                 <w:rFonts w:hint="eastAsia"/>
-                <w:b w:val="0"/>
-                <w:color w:val="000000"/>
-                <w:lang w:eastAsia="zh-CN"/>
-              </w:rPr>
-              <w:t>开发语言</w:t>
-            </w:r>
-          </w:p>
-        </w:tc>
-        <w:tc>
-          <w:tcPr>
-            <w:tcBorders>
-              <w:top w:val="single" w:color="000000" w:sz="4" w:space="0"/>
-              <w:left w:val="nil"/>
-              <w:bottom w:val="nil"/>
-              <w:right w:val="nil"/>
-            </w:tcBorders>
-            <w:shd w:val="clear" w:color="auto" w:fill="FFFFFF"/>
-          </w:tcPr>
-          <w:p>
-            <w:pPr>
-              <w:pStyle w:val="41"/>
-              <w:spacing w:before="93" w:after="93"/>
-              <w:rPr>
-                <w:rFonts w:hint="eastAsia"/>
-                <w:b w:val="0"/>
-                <w:color w:val="000000"/>
-                <w:lang w:eastAsia="zh-CN"/>
-              </w:rPr>
-            </w:pPr>
-            <w:r>
-              <w:rPr>
-                <w:rFonts w:hint="eastAsia"/>
-                <w:b w:val="0"/>
-                <w:color w:val="000000"/>
                 <w:lang w:eastAsia="zh-CN"/>
               </w:rPr>
               <w:t>Kotlin</w:t>
@@ -5051,16 +5032,12 @@
               <w:spacing w:before="93" w:after="93"/>
               <w:rPr>
                 <w:rFonts w:hint="eastAsia"/>
-                <w:b w:val="0"/>
-                <w:color w:val="000000"/>
                 <w:lang w:eastAsia="zh-CN"/>
               </w:rPr>
             </w:pPr>
             <w:r>
               <w:rPr>
                 <w:rFonts w:hint="eastAsia"/>
-                <w:b w:val="0"/>
-                <w:color w:val="000000"/>
                 <w:lang w:eastAsia="zh-CN"/>
               </w:rPr>
               <w:t>2.0.21</w:t>
@@ -5087,6 +5064,35 @@
         </w:tblPrEx>
         <w:tc>
           <w:tcPr>
+            <w:tcW w:w="2058" w:type="dxa"/>
+            <w:tcBorders>
+              <w:top w:val="nil"/>
+              <w:bottom w:val="nil"/>
+              <w:right w:val="nil"/>
+            </w:tcBorders>
+            <w:shd w:val="clear" w:color="auto" w:fill="FFFFFF"/>
+          </w:tcPr>
+          <w:p>
+            <w:pPr>
+              <w:pStyle w:val="41"/>
+              <w:spacing w:before="93" w:after="93"/>
+              <w:rPr>
+                <w:rFonts w:hint="eastAsia"/>
+                <w:lang w:eastAsia="zh-CN"/>
+              </w:rPr>
+            </w:pPr>
+            <w:r>
+              <w:rPr>
+                <w:rFonts w:hint="eastAsia"/>
+                <w:lang w:eastAsia="zh-CN"/>
+              </w:rPr>
+              <w:t>UI框架</w:t>
+            </w:r>
+          </w:p>
+        </w:tc>
+        <w:tc>
+          <w:tcPr>
+            <w:tcW w:w="4860" w:type="dxa"/>
             <w:tcBorders>
               <w:top w:val="nil"/>
               <w:left w:val="nil"/>
@@ -5101,48 +5107,12 @@
               <w:spacing w:before="93" w:after="93"/>
               <w:rPr>
                 <w:rFonts w:hint="eastAsia"/>
-                <w:b w:val="0"/>
-                <w:color w:val="000000"/>
                 <w:lang w:eastAsia="zh-CN"/>
               </w:rPr>
             </w:pPr>
             <w:r>
               <w:rPr>
                 <w:rFonts w:hint="eastAsia"/>
-                <w:b w:val="0"/>
-                <w:color w:val="000000"/>
-                <w:lang w:eastAsia="zh-CN"/>
-              </w:rPr>
-              <w:t>UI框架</w:t>
-            </w:r>
-          </w:p>
-        </w:tc>
-        <w:tc>
-          <w:tcPr>
-            <w:tcBorders>
-              <w:top w:val="nil"/>
-              <w:left w:val="nil"/>
-              <w:bottom w:val="nil"/>
-              <w:right w:val="nil"/>
-            </w:tcBorders>
-            <w:shd w:val="clear" w:color="auto" w:fill="FFFFFF"/>
-          </w:tcPr>
-          <w:p>
-            <w:pPr>
-              <w:pStyle w:val="41"/>
-              <w:spacing w:before="93" w:after="93"/>
-              <w:rPr>
-                <w:rFonts w:hint="eastAsia"/>
-                <w:b w:val="0"/>
-                <w:color w:val="000000"/>
-                <w:lang w:eastAsia="zh-CN"/>
-              </w:rPr>
-            </w:pPr>
-            <w:r>
-              <w:rPr>
-                <w:rFonts w:hint="eastAsia"/>
-                <w:b w:val="0"/>
-                <w:color w:val="000000"/>
                 <w:lang w:eastAsia="zh-CN"/>
               </w:rPr>
               <w:t>Jetpack Compose</w:t>
@@ -5165,16 +5135,12 @@
               <w:spacing w:before="93" w:after="93"/>
               <w:rPr>
                 <w:rFonts w:hint="eastAsia"/>
-                <w:b w:val="0"/>
-                <w:color w:val="000000"/>
                 <w:lang w:eastAsia="zh-CN"/>
               </w:rPr>
             </w:pPr>
             <w:r>
               <w:rPr>
                 <w:rFonts w:hint="eastAsia"/>
-                <w:b w:val="0"/>
-                <w:color w:val="000000"/>
                 <w:lang w:eastAsia="zh-CN"/>
               </w:rPr>
               <w:t>1.5.4</w:t>
@@ -5204,7 +5170,6 @@
             <w:tcW w:w="2058" w:type="dxa"/>
             <w:tcBorders>
               <w:top w:val="nil"/>
-              <w:left w:val="nil"/>
               <w:bottom w:val="nil"/>
               <w:right w:val="nil"/>
             </w:tcBorders>
@@ -5217,16 +5182,12 @@
               <w:spacing w:before="93" w:after="93"/>
               <w:rPr>
                 <w:rFonts w:hint="eastAsia"/>
-                <w:b w:val="0"/>
-                <w:color w:val="000000"/>
                 <w:lang w:eastAsia="zh-CN"/>
               </w:rPr>
             </w:pPr>
             <w:r>
               <w:rPr>
                 <w:rFonts w:hint="eastAsia"/>
-                <w:b w:val="0"/>
-                <w:color w:val="000000"/>
                 <w:lang w:eastAsia="zh-CN"/>
               </w:rPr>
               <w:t>设计系统</w:t>
@@ -5251,16 +5212,12 @@
               <w:spacing w:before="93" w:after="93"/>
               <w:rPr>
                 <w:rFonts w:hint="eastAsia"/>
-                <w:b w:val="0"/>
-                <w:color w:val="000000"/>
                 <w:lang w:eastAsia="zh-CN"/>
               </w:rPr>
             </w:pPr>
             <w:r>
               <w:rPr>
                 <w:rFonts w:hint="eastAsia"/>
-                <w:b w:val="0"/>
-                <w:color w:val="000000"/>
                 <w:lang w:eastAsia="zh-CN"/>
               </w:rPr>
               <w:t>Material 3</w:t>
@@ -5285,16 +5242,12 @@
               <w:spacing w:before="93" w:after="93"/>
               <w:rPr>
                 <w:rFonts w:hint="eastAsia"/>
-                <w:b w:val="0"/>
-                <w:color w:val="000000"/>
                 <w:lang w:eastAsia="zh-CN"/>
               </w:rPr>
             </w:pPr>
             <w:r>
               <w:rPr>
                 <w:rFonts w:hint="eastAsia"/>
-                <w:b w:val="0"/>
-                <w:color w:val="000000"/>
                 <w:lang w:eastAsia="zh-CN"/>
               </w:rPr>
               <w:t>-</w:t>
@@ -5321,6 +5274,35 @@
         </w:tblPrEx>
         <w:tc>
           <w:tcPr>
+            <w:tcW w:w="2058" w:type="dxa"/>
+            <w:tcBorders>
+              <w:top w:val="nil"/>
+              <w:bottom w:val="nil"/>
+              <w:right w:val="nil"/>
+            </w:tcBorders>
+            <w:shd w:val="clear" w:color="auto" w:fill="FFFFFF"/>
+          </w:tcPr>
+          <w:p>
+            <w:pPr>
+              <w:pStyle w:val="41"/>
+              <w:spacing w:before="93" w:after="93"/>
+              <w:rPr>
+                <w:rFonts w:hint="eastAsia"/>
+                <w:lang w:eastAsia="zh-CN"/>
+              </w:rPr>
+            </w:pPr>
+            <w:r>
+              <w:rPr>
+                <w:rFonts w:hint="eastAsia"/>
+                <w:lang w:eastAsia="zh-CN"/>
+              </w:rPr>
+              <w:t>相机API</w:t>
+            </w:r>
+          </w:p>
+        </w:tc>
+        <w:tc>
+          <w:tcPr>
+            <w:tcW w:w="4860" w:type="dxa"/>
             <w:tcBorders>
               <w:top w:val="nil"/>
               <w:left w:val="nil"/>
@@ -5334,49 +5316,13 @@
               <w:pStyle w:val="41"/>
               <w:spacing w:before="93" w:after="93"/>
               <w:rPr>
-                <w:rFonts w:hint="eastAsia"/>
-                <w:b w:val="0"/>
-                <w:color w:val="000000"/>
-                <w:lang w:eastAsia="zh-CN"/>
+                <w:rFonts w:hint="default"/>
+                <w:lang w:val="en-US" w:eastAsia="zh-CN"/>
               </w:rPr>
             </w:pPr>
             <w:r>
               <w:rPr>
                 <w:rFonts w:hint="eastAsia"/>
-                <w:b w:val="0"/>
-                <w:color w:val="000000"/>
-                <w:lang w:eastAsia="zh-CN"/>
-              </w:rPr>
-              <w:t>相机API</w:t>
-            </w:r>
-          </w:p>
-        </w:tc>
-        <w:tc>
-          <w:tcPr>
-            <w:tcBorders>
-              <w:top w:val="nil"/>
-              <w:left w:val="nil"/>
-              <w:bottom w:val="nil"/>
-              <w:right w:val="nil"/>
-            </w:tcBorders>
-            <w:shd w:val="clear" w:color="auto" w:fill="FFFFFF"/>
-          </w:tcPr>
-          <w:p>
-            <w:pPr>
-              <w:pStyle w:val="41"/>
-              <w:spacing w:before="93" w:after="93"/>
-              <w:rPr>
-                <w:rFonts w:hint="default"/>
-                <w:b w:val="0"/>
-                <w:color w:val="000000"/>
-                <w:lang w:val="en-US" w:eastAsia="zh-CN"/>
-              </w:rPr>
-            </w:pPr>
-            <w:r>
-              <w:rPr>
-                <w:rFonts w:hint="eastAsia"/>
-                <w:b w:val="0"/>
-                <w:color w:val="000000"/>
                 <w:lang w:eastAsia="zh-CN"/>
               </w:rPr>
               <w:t>CameraX</w:t>
@@ -5399,16 +5345,12 @@
               <w:spacing w:before="93" w:after="93"/>
               <w:rPr>
                 <w:rFonts w:hint="eastAsia"/>
-                <w:b w:val="0"/>
-                <w:color w:val="000000"/>
                 <w:lang w:eastAsia="zh-CN"/>
               </w:rPr>
             </w:pPr>
             <w:r>
               <w:rPr>
                 <w:rFonts w:hint="eastAsia"/>
-                <w:b w:val="0"/>
-                <w:color w:val="000000"/>
                 <w:lang w:eastAsia="zh-CN"/>
               </w:rPr>
               <w:t>1.4.1</w:t>
@@ -5435,6 +5377,35 @@
         </w:tblPrEx>
         <w:tc>
           <w:tcPr>
+            <w:tcW w:w="2058" w:type="dxa"/>
+            <w:tcBorders>
+              <w:top w:val="nil"/>
+              <w:bottom w:val="nil"/>
+              <w:right w:val="nil"/>
+            </w:tcBorders>
+            <w:shd w:val="clear" w:color="auto" w:fill="FFFFFF"/>
+          </w:tcPr>
+          <w:p>
+            <w:pPr>
+              <w:pStyle w:val="41"/>
+              <w:spacing w:before="93" w:after="93"/>
+              <w:rPr>
+                <w:rFonts w:hint="eastAsia"/>
+                <w:lang w:eastAsia="zh-CN"/>
+              </w:rPr>
+            </w:pPr>
+            <w:r>
+              <w:rPr>
+                <w:rFonts w:hint="eastAsia"/>
+                <w:lang w:eastAsia="zh-CN"/>
+              </w:rPr>
+              <w:t>AI推理</w:t>
+            </w:r>
+          </w:p>
+        </w:tc>
+        <w:tc>
+          <w:tcPr>
+            <w:tcW w:w="4860" w:type="dxa"/>
             <w:tcBorders>
               <w:top w:val="nil"/>
               <w:left w:val="nil"/>
@@ -5449,48 +5420,12 @@
               <w:spacing w:before="93" w:after="93"/>
               <w:rPr>
                 <w:rFonts w:hint="eastAsia"/>
-                <w:b w:val="0"/>
-                <w:color w:val="000000"/>
                 <w:lang w:eastAsia="zh-CN"/>
               </w:rPr>
             </w:pPr>
             <w:r>
               <w:rPr>
                 <w:rFonts w:hint="eastAsia"/>
-                <w:b w:val="0"/>
-                <w:color w:val="000000"/>
-                <w:lang w:eastAsia="zh-CN"/>
-              </w:rPr>
-              <w:t>AI推理</w:t>
-            </w:r>
-          </w:p>
-        </w:tc>
-        <w:tc>
-          <w:tcPr>
-            <w:tcBorders>
-              <w:top w:val="nil"/>
-              <w:left w:val="nil"/>
-              <w:bottom w:val="nil"/>
-              <w:right w:val="nil"/>
-            </w:tcBorders>
-            <w:shd w:val="clear" w:color="auto" w:fill="FFFFFF"/>
-          </w:tcPr>
-          <w:p>
-            <w:pPr>
-              <w:pStyle w:val="41"/>
-              <w:spacing w:before="93" w:after="93"/>
-              <w:rPr>
-                <w:rFonts w:hint="eastAsia"/>
-                <w:b w:val="0"/>
-                <w:color w:val="000000"/>
-                <w:lang w:eastAsia="zh-CN"/>
-              </w:rPr>
-            </w:pPr>
-            <w:r>
-              <w:rPr>
-                <w:rFonts w:hint="eastAsia"/>
-                <w:b w:val="0"/>
-                <w:color w:val="000000"/>
                 <w:lang w:eastAsia="zh-CN"/>
               </w:rPr>
               <w:t>ONNX Runtime</w:t>
@@ -5513,16 +5448,12 @@
               <w:spacing w:before="93" w:after="93"/>
               <w:rPr>
                 <w:rFonts w:hint="eastAsia"/>
-                <w:b w:val="0"/>
-                <w:color w:val="000000"/>
                 <w:lang w:eastAsia="zh-CN"/>
               </w:rPr>
             </w:pPr>
             <w:r>
               <w:rPr>
                 <w:rFonts w:hint="eastAsia"/>
-                <w:b w:val="0"/>
-                <w:color w:val="000000"/>
                 <w:lang w:eastAsia="zh-CN"/>
               </w:rPr>
               <w:t>1.19.0</w:t>
@@ -5552,7 +5483,6 @@
             <w:tcW w:w="2058" w:type="dxa"/>
             <w:tcBorders>
               <w:top w:val="nil"/>
-              <w:left w:val="nil"/>
               <w:bottom w:val="nil"/>
               <w:right w:val="nil"/>
             </w:tcBorders>
@@ -5565,16 +5495,12 @@
               <w:spacing w:before="93" w:after="93"/>
               <w:rPr>
                 <w:rFonts w:hint="eastAsia"/>
-                <w:b w:val="0"/>
-                <w:color w:val="000000"/>
                 <w:lang w:eastAsia="zh-CN"/>
               </w:rPr>
             </w:pPr>
             <w:r>
               <w:rPr>
                 <w:rFonts w:hint="eastAsia"/>
-                <w:b w:val="0"/>
-                <w:color w:val="000000"/>
                 <w:lang w:eastAsia="zh-CN"/>
               </w:rPr>
               <w:t>场景识别</w:t>
@@ -5599,16 +5525,12 @@
               <w:spacing w:before="93" w:after="93"/>
               <w:rPr>
                 <w:rFonts w:hint="eastAsia"/>
-                <w:b w:val="0"/>
-                <w:color w:val="000000"/>
                 <w:lang w:eastAsia="zh-CN"/>
               </w:rPr>
             </w:pPr>
             <w:r>
               <w:rPr>
                 <w:rFonts w:hint="eastAsia"/>
-                <w:b w:val="0"/>
-                <w:color w:val="000000"/>
                 <w:lang w:eastAsia="zh-CN"/>
               </w:rPr>
               <w:t>ML Kit Image Labeling</w:t>
@@ -5633,16 +5555,12 @@
               <w:spacing w:before="93" w:after="93"/>
               <w:rPr>
                 <w:rFonts w:hint="eastAsia"/>
-                <w:b w:val="0"/>
-                <w:color w:val="000000"/>
                 <w:lang w:eastAsia="zh-CN"/>
               </w:rPr>
             </w:pPr>
             <w:r>
               <w:rPr>
                 <w:rFonts w:hint="eastAsia"/>
-                <w:b w:val="0"/>
-                <w:color w:val="000000"/>
                 <w:lang w:eastAsia="zh-CN"/>
               </w:rPr>
               <w:t>17.0.9</w:t>
@@ -5672,7 +5590,6 @@
             <w:tcW w:w="2058" w:type="dxa"/>
             <w:tcBorders>
               <w:top w:val="nil"/>
-              <w:left w:val="nil"/>
               <w:bottom w:val="nil"/>
               <w:right w:val="nil"/>
             </w:tcBorders>
@@ -5685,16 +5602,12 @@
               <w:spacing w:before="93" w:after="93"/>
               <w:rPr>
                 <w:rFonts w:hint="eastAsia"/>
-                <w:b w:val="0"/>
-                <w:color w:val="000000"/>
                 <w:lang w:eastAsia="zh-CN"/>
               </w:rPr>
             </w:pPr>
             <w:r>
               <w:rPr>
                 <w:rFonts w:hint="eastAsia"/>
-                <w:b w:val="0"/>
-                <w:color w:val="000000"/>
                 <w:lang w:eastAsia="zh-CN"/>
               </w:rPr>
               <w:t>人脸检测</w:t>
@@ -5719,16 +5632,12 @@
               <w:spacing w:before="93" w:after="93"/>
               <w:rPr>
                 <w:rFonts w:hint="eastAsia"/>
-                <w:b w:val="0"/>
-                <w:color w:val="000000"/>
                 <w:lang w:eastAsia="zh-CN"/>
               </w:rPr>
             </w:pPr>
             <w:r>
               <w:rPr>
                 <w:rFonts w:hint="eastAsia"/>
-                <w:b w:val="0"/>
-                <w:color w:val="000000"/>
                 <w:lang w:eastAsia="zh-CN"/>
               </w:rPr>
               <w:t>ML Kit Face Detection</w:t>
@@ -5753,16 +5662,12 @@
               <w:spacing w:before="93" w:after="93"/>
               <w:rPr>
                 <w:rFonts w:hint="eastAsia"/>
-                <w:b w:val="0"/>
-                <w:color w:val="000000"/>
                 <w:lang w:eastAsia="zh-CN"/>
               </w:rPr>
             </w:pPr>
             <w:r>
               <w:rPr>
                 <w:rFonts w:hint="eastAsia"/>
-                <w:b w:val="0"/>
-                <w:color w:val="000000"/>
                 <w:lang w:eastAsia="zh-CN"/>
               </w:rPr>
               <w:t>16.1.7</w:t>
@@ -5792,7 +5697,6 @@
             <w:tcW w:w="2058" w:type="dxa"/>
             <w:tcBorders>
               <w:top w:val="nil"/>
-              <w:left w:val="nil"/>
               <w:bottom w:val="nil"/>
               <w:right w:val="nil"/>
             </w:tcBorders>
@@ -5805,16 +5709,12 @@
               <w:spacing w:before="93" w:after="93"/>
               <w:rPr>
                 <w:rFonts w:hint="eastAsia"/>
-                <w:b w:val="0"/>
-                <w:color w:val="000000"/>
                 <w:lang w:eastAsia="zh-CN"/>
               </w:rPr>
             </w:pPr>
             <w:r>
               <w:rPr>
                 <w:rFonts w:hint="eastAsia"/>
-                <w:b w:val="0"/>
-                <w:color w:val="000000"/>
                 <w:lang w:eastAsia="zh-CN"/>
               </w:rPr>
               <w:t>物体检测</w:t>
@@ -5839,16 +5739,12 @@
               <w:spacing w:before="93" w:after="93"/>
               <w:rPr>
                 <w:rFonts w:hint="eastAsia"/>
-                <w:b w:val="0"/>
-                <w:color w:val="000000"/>
                 <w:lang w:eastAsia="zh-CN"/>
               </w:rPr>
             </w:pPr>
             <w:r>
               <w:rPr>
                 <w:rFonts w:hint="eastAsia"/>
-                <w:b w:val="0"/>
-                <w:color w:val="000000"/>
                 <w:lang w:eastAsia="zh-CN"/>
               </w:rPr>
               <w:t>ML Kit Object Detection</w:t>
@@ -5873,16 +5769,12 @@
               <w:spacing w:before="93" w:after="93"/>
               <w:rPr>
                 <w:rFonts w:hint="eastAsia"/>
-                <w:b w:val="0"/>
-                <w:color w:val="000000"/>
                 <w:lang w:eastAsia="zh-CN"/>
               </w:rPr>
             </w:pPr>
             <w:r>
               <w:rPr>
                 <w:rFonts w:hint="eastAsia"/>
-                <w:b w:val="0"/>
-                <w:color w:val="000000"/>
                 <w:lang w:eastAsia="zh-CN"/>
               </w:rPr>
               <w:t>17.0.2</w:t>
@@ -5912,7 +5804,6 @@
             <w:tcW w:w="2058" w:type="dxa"/>
             <w:tcBorders>
               <w:top w:val="nil"/>
-              <w:left w:val="nil"/>
               <w:bottom w:val="nil"/>
               <w:right w:val="nil"/>
             </w:tcBorders>
@@ -5925,16 +5816,12 @@
               <w:spacing w:before="93" w:after="93"/>
               <w:rPr>
                 <w:rFonts w:hint="eastAsia"/>
-                <w:b w:val="0"/>
-                <w:color w:val="000000"/>
                 <w:lang w:eastAsia="zh-CN"/>
               </w:rPr>
             </w:pPr>
             <w:r>
               <w:rPr>
                 <w:rFonts w:hint="eastAsia"/>
-                <w:b w:val="0"/>
-                <w:color w:val="000000"/>
                 <w:lang w:eastAsia="zh-CN"/>
               </w:rPr>
               <w:t>云端 AI</w:t>
@@ -5959,16 +5846,12 @@
               <w:spacing w:before="93" w:after="93"/>
               <w:rPr>
                 <w:rFonts w:hint="eastAsia"/>
-                <w:b w:val="0"/>
-                <w:color w:val="000000"/>
                 <w:lang w:eastAsia="zh-CN"/>
               </w:rPr>
             </w:pPr>
             <w:r>
               <w:rPr>
                 <w:rFonts w:hint="eastAsia"/>
-                <w:b w:val="0"/>
-                <w:color w:val="000000"/>
                 <w:lang w:eastAsia="zh-CN"/>
               </w:rPr>
               <w:t>阿里云百炼</w:t>
@@ -5993,16 +5876,12 @@
               <w:spacing w:before="93" w:after="93"/>
               <w:rPr>
                 <w:rFonts w:hint="eastAsia"/>
-                <w:b w:val="0"/>
-                <w:color w:val="000000"/>
                 <w:lang w:eastAsia="zh-CN"/>
               </w:rPr>
             </w:pPr>
             <w:r>
               <w:rPr>
                 <w:rFonts w:hint="eastAsia"/>
-                <w:b w:val="0"/>
-                <w:color w:val="000000"/>
                 <w:lang w:eastAsia="zh-CN"/>
               </w:rPr>
               <w:t>qwen-vl-plus</w:t>
@@ -6032,7 +5911,6 @@
             <w:tcW w:w="2058" w:type="dxa"/>
             <w:tcBorders>
               <w:top w:val="nil"/>
-              <w:left w:val="nil"/>
               <w:bottom w:val="nil"/>
               <w:right w:val="nil"/>
             </w:tcBorders>
@@ -6045,16 +5923,12 @@
               <w:spacing w:before="93" w:after="93"/>
               <w:rPr>
                 <w:rFonts w:hint="eastAsia"/>
-                <w:b w:val="0"/>
-                <w:color w:val="000000"/>
                 <w:lang w:eastAsia="zh-CN"/>
               </w:rPr>
             </w:pPr>
             <w:r>
               <w:rPr>
                 <w:rFonts w:hint="eastAsia"/>
-                <w:b w:val="0"/>
-                <w:color w:val="000000"/>
                 <w:lang w:eastAsia="zh-CN"/>
               </w:rPr>
               <w:t>图片加载</w:t>
@@ -6079,16 +5953,12 @@
               <w:spacing w:before="93" w:after="93"/>
               <w:rPr>
                 <w:rFonts w:hint="eastAsia"/>
-                <w:b w:val="0"/>
-                <w:color w:val="000000"/>
                 <w:lang w:eastAsia="zh-CN"/>
               </w:rPr>
             </w:pPr>
             <w:r>
               <w:rPr>
                 <w:rFonts w:hint="eastAsia"/>
-                <w:b w:val="0"/>
-                <w:color w:val="000000"/>
                 <w:lang w:eastAsia="zh-CN"/>
               </w:rPr>
               <w:t>Coil</w:t>
@@ -6113,16 +5983,12 @@
               <w:spacing w:before="93" w:after="93"/>
               <w:rPr>
                 <w:rFonts w:hint="eastAsia"/>
-                <w:b w:val="0"/>
-                <w:color w:val="000000"/>
                 <w:lang w:eastAsia="zh-CN"/>
               </w:rPr>
             </w:pPr>
             <w:r>
               <w:rPr>
                 <w:rFonts w:hint="eastAsia"/>
-                <w:b w:val="0"/>
-                <w:color w:val="000000"/>
                 <w:lang w:eastAsia="zh-CN"/>
               </w:rPr>
               <w:t>2.4.0</w:t>
@@ -6152,7 +6018,6 @@
             <w:tcW w:w="2058" w:type="dxa"/>
             <w:tcBorders>
               <w:top w:val="nil"/>
-              <w:left w:val="nil"/>
               <w:bottom w:val="single" w:color="000000" w:sz="12" w:space="0"/>
               <w:right w:val="nil"/>
             </w:tcBorders>
@@ -6165,16 +6030,12 @@
               <w:spacing w:before="93" w:after="93"/>
               <w:rPr>
                 <w:rFonts w:hint="eastAsia"/>
-                <w:b w:val="0"/>
-                <w:color w:val="000000"/>
                 <w:lang w:eastAsia="zh-CN"/>
               </w:rPr>
             </w:pPr>
             <w:r>
               <w:rPr>
                 <w:rFonts w:hint="eastAsia"/>
-                <w:b w:val="0"/>
-                <w:color w:val="000000"/>
                 <w:lang w:eastAsia="zh-CN"/>
               </w:rPr>
               <w:t>权限管理</w:t>
@@ -6199,16 +6060,12 @@
               <w:spacing w:before="93" w:after="93"/>
               <w:rPr>
                 <w:rFonts w:hint="eastAsia"/>
-                <w:b w:val="0"/>
-                <w:color w:val="000000"/>
                 <w:lang w:eastAsia="zh-CN"/>
               </w:rPr>
             </w:pPr>
             <w:r>
               <w:rPr>
                 <w:rFonts w:hint="eastAsia"/>
-                <w:b w:val="0"/>
-                <w:color w:val="000000"/>
                 <w:lang w:eastAsia="zh-CN"/>
               </w:rPr>
               <w:t>Accompanist</w:t>
@@ -6233,16 +6090,12 @@
               <w:spacing w:before="93" w:after="93"/>
               <w:rPr>
                 <w:rFonts w:hint="eastAsia"/>
-                <w:b w:val="0"/>
-                <w:color w:val="000000"/>
                 <w:lang w:eastAsia="zh-CN"/>
               </w:rPr>
             </w:pPr>
             <w:r>
               <w:rPr>
                 <w:rFonts w:hint="eastAsia"/>
-                <w:b w:val="0"/>
-                <w:color w:val="000000"/>
                 <w:lang w:eastAsia="zh-CN"/>
               </w:rPr>
               <w:t>0.32.0</w:t>
@@ -6288,6 +6141,76 @@
     </w:p>
     <w:p>
       <w:pPr>
+        <w:pStyle w:val="5"/>
+        <w:bidi w:val="0"/>
+        <w:rPr>
+          <w:rFonts w:hint="eastAsia"/>
+          <w:lang w:eastAsia="zh-CN"/>
+        </w:rPr>
+      </w:pPr>
+      <w:r>
+        <w:rPr>
+          <w:rFonts w:hint="eastAsia"/>
+          <w:lang w:eastAsia="zh-CN"/>
+        </w:rPr>
+        <w:t>相机模块</w:t>
+      </w:r>
+      <w:bookmarkStart w:id="34" w:name="_GoBack"/>
+      <w:bookmarkEnd w:id="34"/>
+    </w:p>
+    <w:p>
+      <w:pPr>
+        <w:pStyle w:val="5"/>
+        <w:bidi w:val="0"/>
+        <w:rPr>
+          <w:rFonts w:hint="eastAsia"/>
+          <w:lang w:eastAsia="zh-CN"/>
+        </w:rPr>
+      </w:pPr>
+      <w:r>
+        <w:rPr>
+          <w:rFonts w:hint="eastAsia"/>
+          <w:lang w:eastAsia="zh-CN"/>
+        </w:rPr>
+        <w:t>场景识别模块</w:t>
+      </w:r>
+    </w:p>
+    <w:p>
+      <w:pPr>
+        <w:pStyle w:val="5"/>
+        <w:bidi w:val="0"/>
+        <w:rPr>
+          <w:rFonts w:hint="eastAsia"/>
+          <w:lang w:eastAsia="zh-CN"/>
+        </w:rPr>
+      </w:pPr>
+      <w:r>
+        <w:rPr>
+          <w:rFonts w:hint="eastAsia"/>
+          <w:lang w:eastAsia="zh-CN"/>
+        </w:rPr>
+        <w:t>智能裁剪模块</w:t>
+      </w:r>
+    </w:p>
+    <w:p>
+      <w:pPr>
+        <w:pStyle w:val="5"/>
+        <w:bidi w:val="0"/>
+        <w:rPr>
+          <w:rFonts w:hint="eastAsia"/>
+          <w:lang w:eastAsia="zh-CN"/>
+        </w:rPr>
+      </w:pPr>
+      <w:r>
+        <w:rPr>
+          <w:rFonts w:hint="eastAsia"/>
+          <w:lang w:eastAsia="zh-CN"/>
+        </w:rPr>
+        <w:t>AI 调色模块</w:t>
+      </w:r>
+    </w:p>
+    <w:p>
+      <w:pPr>
         <w:rPr>
           <w:rFonts w:hint="eastAsia"/>
           <w:lang w:eastAsia="zh-CN"/>
@@ -6324,14 +6247,6 @@
         </w:rPr>
         <w:br w:type="page"/>
       </w:r>
-    </w:p>
-    <w:p>
-      <w:pPr>
-        <w:rPr>
-          <w:rFonts w:hint="eastAsia"/>
-          <w:lang w:eastAsia="zh-CN"/>
-        </w:rPr>
-      </w:pPr>
     </w:p>
     <w:p>
       <w:pPr>
@@ -6341,14 +6256,14 @@
         </w:numPr>
         <w:spacing w:before="936" w:after="156"/>
       </w:pPr>
-      <w:bookmarkStart w:id="16" w:name="_Toc27584"/>
+      <w:bookmarkStart w:id="14" w:name="_Toc27584"/>
       <w:r>
         <w:rPr>
           <w:rFonts w:hint="eastAsia"/>
         </w:rPr>
         <w:t>系统实现</w:t>
       </w:r>
-      <w:bookmarkEnd w:id="16"/>
+      <w:bookmarkEnd w:id="14"/>
     </w:p>
     <w:p>
       <w:pPr>
@@ -6376,8 +6291,8 @@
           <w:lang w:eastAsia="zh-CN"/>
         </w:rPr>
       </w:pPr>
-      <w:bookmarkStart w:id="17" w:name="_Toc11342"/>
-      <w:bookmarkStart w:id="18" w:name="_Toc18140"/>
+      <w:bookmarkStart w:id="15" w:name="_Toc11342"/>
+      <w:bookmarkStart w:id="16" w:name="_Toc18140"/>
       <w:r>
         <w:rPr>
           <w:rFonts w:hint="eastAsia" w:ascii="Arial" w:hAnsi="Arial"/>
@@ -6385,8 +6300,8 @@
         </w:rPr>
         <w:t>界面实现</w:t>
       </w:r>
-      <w:bookmarkEnd w:id="17"/>
-      <w:bookmarkEnd w:id="18"/>
+      <w:bookmarkEnd w:id="15"/>
+      <w:bookmarkEnd w:id="16"/>
     </w:p>
     <w:p>
       <w:pPr>
@@ -6526,8 +6441,8 @@
           <w:lang w:eastAsia="zh-CN"/>
         </w:rPr>
       </w:pPr>
-      <w:bookmarkStart w:id="19" w:name="_Toc22679"/>
-      <w:bookmarkStart w:id="20" w:name="_Toc7774"/>
+      <w:bookmarkStart w:id="17" w:name="_Toc22679"/>
+      <w:bookmarkStart w:id="18" w:name="_Toc7774"/>
       <w:r>
         <w:rPr>
           <w:rFonts w:hint="eastAsia" w:ascii="Arial" w:hAnsi="Arial"/>
@@ -6535,8 +6450,8 @@
         </w:rPr>
         <w:t>组件库实现</w:t>
       </w:r>
-      <w:bookmarkEnd w:id="19"/>
-      <w:bookmarkEnd w:id="20"/>
+      <w:bookmarkEnd w:id="17"/>
+      <w:bookmarkEnd w:id="18"/>
     </w:p>
     <w:p>
       <w:pPr>
@@ -6580,8 +6495,8 @@
           <w:lang w:eastAsia="zh-CN"/>
         </w:rPr>
       </w:pPr>
-      <w:bookmarkStart w:id="21" w:name="_Toc3091"/>
-      <w:bookmarkStart w:id="22" w:name="_Toc32389"/>
+      <w:bookmarkStart w:id="19" w:name="_Toc3091"/>
+      <w:bookmarkStart w:id="20" w:name="_Toc32389"/>
       <w:r>
         <w:rPr>
           <w:rFonts w:hint="eastAsia" w:ascii="Arial" w:hAnsi="Arial"/>
@@ -6589,8 +6504,8 @@
         </w:rPr>
         <w:t>核心功能实现</w:t>
       </w:r>
-      <w:bookmarkEnd w:id="21"/>
-      <w:bookmarkEnd w:id="22"/>
+      <w:bookmarkEnd w:id="19"/>
+      <w:bookmarkEnd w:id="20"/>
     </w:p>
     <w:p>
       <w:pPr>
@@ -6712,8 +6627,8 @@
           <w:lang w:eastAsia="zh-CN"/>
         </w:rPr>
       </w:pPr>
-      <w:bookmarkStart w:id="23" w:name="_Toc13707"/>
-      <w:bookmarkStart w:id="24" w:name="_Toc1658"/>
+      <w:bookmarkStart w:id="21" w:name="_Toc13707"/>
+      <w:bookmarkStart w:id="22" w:name="_Toc1658"/>
       <w:r>
         <w:rPr>
           <w:rFonts w:hint="eastAsia" w:ascii="Arial" w:hAnsi="Arial"/>
@@ -6721,8 +6636,8 @@
         </w:rPr>
         <w:t>性能优化实现</w:t>
       </w:r>
-      <w:bookmarkEnd w:id="23"/>
-      <w:bookmarkEnd w:id="24"/>
+      <w:bookmarkEnd w:id="21"/>
+      <w:bookmarkEnd w:id="22"/>
     </w:p>
     <w:p>
       <w:pPr>
@@ -6785,14 +6700,14 @@
         </w:numPr>
         <w:spacing w:before="936" w:after="156"/>
       </w:pPr>
-      <w:bookmarkStart w:id="25" w:name="_Toc8203"/>
+      <w:bookmarkStart w:id="23" w:name="_Toc8203"/>
       <w:r>
         <w:rPr>
           <w:rFonts w:hint="eastAsia"/>
         </w:rPr>
         <w:t>测试分析</w:t>
       </w:r>
-      <w:bookmarkEnd w:id="25"/>
+      <w:bookmarkEnd w:id="23"/>
     </w:p>
     <w:p>
       <w:pPr>
@@ -6835,8 +6750,8 @@
           <w:lang w:eastAsia="zh-CN"/>
         </w:rPr>
       </w:pPr>
-      <w:bookmarkStart w:id="26" w:name="_Toc8121"/>
-      <w:bookmarkStart w:id="27" w:name="_Toc32506"/>
+      <w:bookmarkStart w:id="24" w:name="_Toc8121"/>
+      <w:bookmarkStart w:id="25" w:name="_Toc32506"/>
       <w:r>
         <w:rPr>
           <w:rFonts w:hint="eastAsia" w:ascii="Arial" w:hAnsi="Arial"/>
@@ -6844,8 +6759,8 @@
         </w:rPr>
         <w:t>功能测试</w:t>
       </w:r>
-      <w:bookmarkEnd w:id="26"/>
-      <w:bookmarkEnd w:id="27"/>
+      <w:bookmarkEnd w:id="24"/>
+      <w:bookmarkEnd w:id="25"/>
     </w:p>
     <w:tbl>
       <w:tblPr>
@@ -6885,12 +6800,6 @@
             <w:insideH w:val="single" w:color="auto" w:sz="4" w:space="0"/>
             <w:insideV w:val="single" w:color="auto" w:sz="4" w:space="0"/>
           </w:tblBorders>
-          <w:tblCellMar>
-            <w:top w:w="0" w:type="dxa"/>
-            <w:left w:w="10" w:type="dxa"/>
-            <w:bottom w:w="0" w:type="dxa"/>
-            <w:right w:w="10" w:type="dxa"/>
-          </w:tblCellMar>
         </w:tblPrEx>
         <w:tc>
           <w:tcPr>
@@ -7919,8 +7828,8 @@
           <w:lang w:eastAsia="zh-CN"/>
         </w:rPr>
       </w:pPr>
-      <w:bookmarkStart w:id="28" w:name="_Toc21074"/>
-      <w:bookmarkStart w:id="29" w:name="_Toc24438"/>
+      <w:bookmarkStart w:id="26" w:name="_Toc21074"/>
+      <w:bookmarkStart w:id="27" w:name="_Toc24438"/>
       <w:r>
         <w:rPr>
           <w:rFonts w:hint="eastAsia" w:ascii="Arial" w:hAnsi="Arial"/>
@@ -7928,8 +7837,8 @@
         </w:rPr>
         <w:t>性能测试结果</w:t>
       </w:r>
-      <w:bookmarkEnd w:id="28"/>
-      <w:bookmarkEnd w:id="29"/>
+      <w:bookmarkEnd w:id="26"/>
+      <w:bookmarkEnd w:id="27"/>
     </w:p>
     <w:p>
       <w:pPr>
@@ -7966,16 +7875,16 @@
         </w:numPr>
         <w:spacing w:before="936" w:after="156"/>
       </w:pPr>
-      <w:bookmarkStart w:id="30" w:name="_Toc70698343"/>
-      <w:bookmarkStart w:id="31" w:name="_Toc1432"/>
+      <w:bookmarkStart w:id="28" w:name="_Toc70698343"/>
+      <w:bookmarkStart w:id="29" w:name="_Toc1432"/>
       <w:r>
         <w:rPr>
           <w:rFonts w:hint="eastAsia"/>
         </w:rPr>
         <w:t>作品总结</w:t>
       </w:r>
-      <w:bookmarkEnd w:id="30"/>
-      <w:bookmarkEnd w:id="31"/>
+      <w:bookmarkEnd w:id="28"/>
+      <w:bookmarkEnd w:id="29"/>
     </w:p>
     <w:p>
       <w:pPr>
@@ -8000,14 +7909,14 @@
         </w:numPr>
         <w:spacing w:before="468" w:after="93"/>
       </w:pPr>
-      <w:bookmarkStart w:id="32" w:name="_Toc15908"/>
+      <w:bookmarkStart w:id="30" w:name="_Toc15908"/>
       <w:r>
         <w:rPr>
           <w:rFonts w:hint="eastAsia"/>
         </w:rPr>
         <w:t>作品特色与创新点</w:t>
       </w:r>
-      <w:bookmarkEnd w:id="32"/>
+      <w:bookmarkEnd w:id="30"/>
     </w:p>
     <w:p>
       <w:pPr>
@@ -8028,7 +7937,7 @@
           <w:rFonts w:hint="eastAsia"/>
           <w:lang w:eastAsia="zh-CN"/>
         </w:rPr>
-        <w:t>（1）【拍前辅助】理念创新：区别于传统后期修图应用，我们的产品从摄影的源头着手，通过实时AI辅助提升拍摄质量。它能在用户按下快门之前，智能分析环境光线、主体姿态和构图元素，提供最佳拍摄时机建议，从而帮助用户捕捉到更生动、更完美的瞬间，避免后期修图的繁琐，让摄影过程更智能、更高效。</w:t>
+        <w:t>（1）“拍前辅助”理念创新：区别于传统后期修图应用，我们的产品从摄影的源头着手，通过实时AI辅助提升拍摄质量。它能在用户按下快门之前，智能分析环境光线、主体姿态和构图元素，提供最佳拍摄时机建议，从而帮助用户捕捉到更生动、更完美的瞬间，避免后期修图的繁琐，让摄影过程更智能、更高效。</w:t>
       </w:r>
     </w:p>
     <w:p>
@@ -8092,7 +8001,7 @@
           <w:rFonts w:hint="eastAsia"/>
           <w:lang w:eastAsia="zh-CN"/>
         </w:rPr>
-        <w:t>（5）自然增强美学：注重影像的自然真实感，AI生成的参数建议严格控制在合理范围内。通过智能算法平衡曝光、对比度和色彩，避免过度处理导致的失真，使照片看起来既美观又保持原汁原味，满足用户对高品质影像的追求，同时培养健康的审美习惯。</w:t>
+        <w:t>（5）自然增强美学：强调影像的自然与真实特质，将人工智能生成的参数建议严格限定于合理区间。借助智能算法精准调节曝光、对比度与色彩，规避因过度处理而产生的失真现象，确保影像在提升美学价值的同时，忠实保留原始特质。此举不仅契合用户对高品质影像的追求，亦有助于推动健康审美观念的养成。</w:t>
       </w:r>
     </w:p>
     <w:p>
@@ -8103,7 +8012,7 @@
         </w:numPr>
         <w:spacing w:before="468" w:after="93"/>
       </w:pPr>
-      <w:bookmarkStart w:id="33" w:name="_Toc20120"/>
+      <w:bookmarkStart w:id="31" w:name="_Toc20120"/>
       <w:r>
         <w:rPr>
           <w:rFonts w:hint="eastAsia"/>
@@ -8123,7 +8032,7 @@
         </w:rPr>
         <w:t>推广</w:t>
       </w:r>
-      <w:bookmarkEnd w:id="33"/>
+      <w:bookmarkEnd w:id="31"/>
     </w:p>
     <w:p>
       <w:pPr>
@@ -8139,7 +8048,7 @@
           <w:rFonts w:hint="eastAsia"/>
           <w:lang w:eastAsia="zh-CN"/>
         </w:rPr>
-        <w:t>该产品的目标用户涵盖摄影新手（寻求构图与参数指导）、社交媒体使用者（追求高效产出精美图片）、旅行爱好者（渴望记录难忘瞬间但技巧有限）以及美食博主（需要快速拍摄并优化食物照片）。</w:t>
+        <w:t>该产品的目标用户涵盖摄影新手（寻求构图与参数指导）、社交媒体使用者（追求高效产出精美图片）、旅行爱好者（渴望记录难忘瞬间但技巧有限）。</w:t>
       </w:r>
       <w:r>
         <w:rPr>
@@ -8218,13 +8127,16 @@
         </w:rPr>
         <w:t>。</w:t>
       </w:r>
-      <w:r>
-        <w:rPr>
-          <w:rFonts w:hint="eastAsia"/>
-          <w:lang w:val="en-US" w:eastAsia="zh-CN"/>
-        </w:rPr>
-        <w:tab/>
-      </w:r>
+    </w:p>
+    <w:p>
+      <w:pPr>
+        <w:pStyle w:val="3"/>
+        <w:ind w:left="0" w:leftChars="0" w:firstLine="420" w:firstLineChars="0"/>
+        <w:rPr>
+          <w:rFonts w:hint="eastAsia"/>
+          <w:lang w:eastAsia="zh-CN"/>
+        </w:rPr>
+      </w:pPr>
       <w:r>
         <w:rPr>
           <w:rFonts w:hint="eastAsia"/>
@@ -8241,14 +8153,14 @@
         </w:numPr>
         <w:spacing w:before="468" w:after="93"/>
       </w:pPr>
-      <w:bookmarkStart w:id="34" w:name="_Toc32287"/>
+      <w:bookmarkStart w:id="32" w:name="_Toc32287"/>
       <w:r>
         <w:rPr>
           <w:rFonts w:hint="eastAsia"/>
         </w:rPr>
         <w:t>作品展望</w:t>
       </w:r>
-      <w:bookmarkEnd w:id="34"/>
+      <w:bookmarkEnd w:id="32"/>
     </w:p>
     <w:p>
       <w:pPr>
@@ -8363,8 +8275,6 @@
         </w:rPr>
         <w:t>打造开放的摄影AI工具集，涵盖模型训练、部署与推理的全套解决方案；建立开发者社区，鼓励用户贡献自定义模型与构图规则；开发插件系统，支持第三方功能扩展，最终形成完整的摄影AI生态体系。</w:t>
       </w:r>
-      <w:bookmarkStart w:id="36" w:name="_GoBack"/>
-      <w:bookmarkEnd w:id="36"/>
     </w:p>
     <w:p>
       <w:pPr>
@@ -8434,14 +8344,14 @@
         </w:tabs>
         <w:spacing w:before="936" w:after="156"/>
       </w:pPr>
-      <w:bookmarkStart w:id="35" w:name="_Toc24405"/>
+      <w:bookmarkStart w:id="33" w:name="_Toc24405"/>
       <w:r>
         <w:rPr>
           <w:rFonts w:hint="eastAsia"/>
         </w:rPr>
         <w:t>参考文献</w:t>
       </w:r>
-      <w:bookmarkEnd w:id="35"/>
+      <w:bookmarkEnd w:id="33"/>
     </w:p>
     <w:p>
       <w:pPr>
@@ -8467,7 +8377,7 @@
         <w:widowControl w:val="0"/>
         <w:numPr>
           <w:ilvl w:val="0"/>
-          <w:numId w:val="6"/>
+          <w:numId w:val="5"/>
         </w:numPr>
         <w:kinsoku/>
         <w:wordWrap w:val="0"/>
@@ -8536,7 +8446,7 @@
         <w:widowControl w:val="0"/>
         <w:numPr>
           <w:ilvl w:val="0"/>
-          <w:numId w:val="6"/>
+          <w:numId w:val="5"/>
         </w:numPr>
         <w:kinsoku/>
         <w:wordWrap w:val="0"/>
@@ -8605,7 +8515,7 @@
         <w:widowControl w:val="0"/>
         <w:numPr>
           <w:ilvl w:val="0"/>
-          <w:numId w:val="6"/>
+          <w:numId w:val="5"/>
         </w:numPr>
         <w:kinsoku/>
         <w:wordWrap w:val="0"/>
@@ -8674,7 +8584,7 @@
         <w:widowControl w:val="0"/>
         <w:numPr>
           <w:ilvl w:val="0"/>
-          <w:numId w:val="6"/>
+          <w:numId w:val="5"/>
         </w:numPr>
         <w:kinsoku/>
         <w:wordWrap w:val="0"/>
@@ -8701,7 +8611,7 @@
         <w:widowControl w:val="0"/>
         <w:numPr>
           <w:ilvl w:val="0"/>
-          <w:numId w:val="6"/>
+          <w:numId w:val="5"/>
         </w:numPr>
         <w:kinsoku/>
         <w:wordWrap w:val="0"/>
@@ -8728,7 +8638,7 @@
         <w:widowControl w:val="0"/>
         <w:numPr>
           <w:ilvl w:val="0"/>
-          <w:numId w:val="6"/>
+          <w:numId w:val="5"/>
         </w:numPr>
         <w:kinsoku/>
         <w:wordWrap w:val="0"/>
@@ -8761,7 +8671,7 @@
         <w:widowControl w:val="0"/>
         <w:numPr>
           <w:ilvl w:val="0"/>
-          <w:numId w:val="6"/>
+          <w:numId w:val="5"/>
         </w:numPr>
         <w:kinsoku/>
         <w:wordWrap w:val="0"/>
@@ -8794,7 +8704,7 @@
         <w:widowControl w:val="0"/>
         <w:numPr>
           <w:ilvl w:val="0"/>
-          <w:numId w:val="6"/>
+          <w:numId w:val="5"/>
         </w:numPr>
         <w:kinsoku/>
         <w:wordWrap w:val="0"/>
@@ -8827,7 +8737,7 @@
         <w:widowControl w:val="0"/>
         <w:numPr>
           <w:ilvl w:val="0"/>
-          <w:numId w:val="6"/>
+          <w:numId w:val="5"/>
         </w:numPr>
         <w:kinsoku/>
         <w:wordWrap w:val="0"/>
@@ -8860,7 +8770,7 @@
         <w:widowControl w:val="0"/>
         <w:numPr>
           <w:ilvl w:val="0"/>
-          <w:numId w:val="6"/>
+          <w:numId w:val="5"/>
         </w:numPr>
         <w:kinsoku/>
         <w:wordWrap w:val="0"/>
@@ -9302,18 +9212,6 @@
       </w:pPr>
     </w:lvl>
   </w:abstractNum>
-  <w:abstractNum w:abstractNumId="4">
-    <w:nsid w:val="3964275A"/>
-    <w:multiLevelType w:val="singleLevel"/>
-    <w:tmpl w:val="3964275A"/>
-    <w:lvl w:ilvl="0" w:tentative="0">
-      <w:start w:val="1"/>
-      <w:numFmt w:val="decimal"/>
-      <w:suff w:val="nothing"/>
-      <w:lvlText w:val="（%1）"/>
-      <w:lvlJc w:val="left"/>
-    </w:lvl>
-  </w:abstractNum>
   <w:num w:numId="1">
     <w:abstractNumId w:val="2"/>
   </w:num>
@@ -9354,9 +9252,6 @@
     </w:lvlOverride>
   </w:num>
   <w:num w:numId="5">
-    <w:abstractNumId w:val="4"/>
-  </w:num>
-  <w:num w:numId="6">
     <w:abstractNumId w:val="0"/>
   </w:num>
 </w:numbering>

</xml_diff>